<commit_message>
docs: harden plug-and-play playbook prompts (assertive roles, consolidated INPUTS blocks, capability guards, explicit output formats, --project-dir wiring) and regenerate DOCX twin
</commit_message>
<xml_diff>
--- a/PLUG_AND_PLAY_PROMPTS.docx
+++ b/PLUG_AND_PLAY_PROMPTS.docx
@@ -2,7 +2,7 @@
 <file path=word/document.xml><?xml version="1.0" encoding="utf-8"?>
 <w:document xmlns:w="http://schemas.openxmlformats.org/wordprocessingml/2006/main" xmlns:m="http://schemas.openxmlformats.org/officeDocument/2006/math" xmlns:r="http://schemas.openxmlformats.org/officeDocument/2006/relationships" xmlns:o="urn:schemas-microsoft-com:office:office" xmlns:v="urn:schemas-microsoft-com:vml" xmlns:w10="urn:schemas-microsoft-com:office:word" xmlns:a="http://schemas.openxmlformats.org/drawingml/2006/main" xmlns:pic="http://schemas.openxmlformats.org/drawingml/2006/picture" xmlns:wp="http://schemas.openxmlformats.org/drawingml/2006/wordprocessingDrawing">
   <w:body>
-    <w:bookmarkStart w:id="11" w:name="X439f4770241006e4d862352c0e06b307097c22e"/>
+    <w:bookmarkStart w:id="11" w:name="Xc0a84ab0c0ff4ff1494b13a7642a74fcc0123ce"/>
     <w:p>
       <w:pPr>
         <w:pStyle w:val="Heading1"/>
@@ -86,7 +86,7 @@
         </w:pict>
       </w:r>
     </w:p>
-    <w:bookmarkStart w:id="10" w:name="how-to-use-this-playbook"/>
+    <w:bookmarkStart w:id="10" w:name="books-how-to-use-this-playbook"/>
     <w:p>
       <w:pPr>
         <w:pStyle w:val="Heading2"/>
@@ -151,7 +151,37 @@
         <w:t xml:space="preserve"> </w:t>
       </w:r>
       <w:r>
-        <w:t xml:space="preserve">must be replaced with your real values (paths, names, numbers).</w:t>
+        <w:t xml:space="preserve">must be replaced with your real values (paths, names, numbers). Each prompt keeps its placeholders in one</w:t>
+      </w:r>
+      <w:r>
+        <w:t xml:space="preserve"> </w:t>
+      </w:r>
+      <w:r>
+        <w:rPr>
+          <w:rStyle w:val="VerbatimChar"/>
+        </w:rPr>
+        <w:t xml:space="preserve">&lt;INPUTS&gt;</w:t>
+      </w:r>
+      <w:r>
+        <w:t xml:space="preserve"> </w:t>
+      </w:r>
+      <w:r>
+        <w:t xml:space="preserve">block; fill every one before pasting, and paste the actual target text wherever a</w:t>
+      </w:r>
+      <w:r>
+        <w:t xml:space="preserve"> </w:t>
+      </w:r>
+      <w:r>
+        <w:rPr>
+          <w:rStyle w:val="VerbatimChar"/>
+        </w:rPr>
+        <w:t xml:space="preserve">[PASTE_...]</w:t>
+      </w:r>
+      <w:r>
+        <w:t xml:space="preserve"> </w:t>
+      </w:r>
+      <w:r>
+        <w:t xml:space="preserve">placeholder appears.</w:t>
       </w:r>
     </w:p>
     <w:p>
@@ -173,7 +203,7 @@
         <w:t xml:space="preserve"> </w:t>
       </w:r>
       <w:r>
-        <w:t xml:space="preserve">into your AI assistant (Claude, GPT, DeepSeek, Gemini, or the repo’s own</w:t>
+        <w:t xml:space="preserve">into your AI assistant (Claude, GPT, DeepSeek, Gemini, or the repo's own</w:t>
       </w:r>
       <w:r>
         <w:t xml:space="preserve"> </w:t>
@@ -219,20 +249,41 @@
         <w:t xml:space="preserve">) so the files the prompt references actually exist.</w:t>
       </w:r>
     </w:p>
+    <w:p>
+      <w:pPr>
+        <w:pStyle w:val="Compact"/>
+        <w:numPr>
+          <w:ilvl w:val="0"/>
+          <w:numId w:val="1001"/>
+        </w:numPr>
+      </w:pPr>
+      <w:r>
+        <w:rPr>
+          <w:b/>
+          <w:bCs/>
+        </w:rPr>
+        <w:t xml:space="preserve">Mind the capability guard</w:t>
+      </w:r>
+      <w:r>
+        <w:t xml:space="preserve"> </w:t>
+      </w:r>
+      <w:r>
+        <w:t xml:space="preserve">— prompts that reference repo modules work best in an agent with file/code access (Claude Code, opencode, Cursor) running inside this repo. In a plain chat with no file access, paste the actual file contents into the prompt instead; every prompt below instructs the model to STOP and ask rather than simulate missing files.</w:t>
+      </w:r>
+    </w:p>
     <w:bookmarkStart w:id="9" w:name="repo-map-what-youll-be-referencing"/>
     <w:p>
       <w:pPr>
         <w:pStyle w:val="Heading3"/>
       </w:pPr>
       <w:r>
-        <w:t xml:space="preserve">Repo Map (what you’ll be referencing)</w:t>
+        <w:t xml:space="preserve">Repo Map (what you'll be referencing)</w:t>
       </w:r>
     </w:p>
     <w:tbl>
       <w:tblPr>
         <w:tblStyle w:val="Table"/>
-        <w:tblW w:type="pct" w:w="5000"/>
-        <w:tblLayout w:type="fixed"/>
+        <w:tblW w:type="auto" w:w="0"/>
         <w:tblLook w:firstRow="1" w:lastRow="0" w:firstColumn="0" w:lastColumn="0" w:noHBand="0" w:noVBand="0" w:val="0020"/>
       </w:tblPr>
       <w:tblGrid>
@@ -301,7 +352,7 @@
               <w:pStyle w:val="Compact"/>
             </w:pPr>
             <w:r>
-              <w:t xml:space="preserve">Literature search (PubMed, ScienceDirect, Scholar, CrossRef, Europe PMC…)</w:t>
+              <w:t xml:space="preserve">Literature search (PubMed, ScienceDirect, Scholar, CrossRef, Europe PMC...)</w:t>
             </w:r>
           </w:p>
         </w:tc>
@@ -592,7 +643,7 @@
               <w:pStyle w:val="Compact"/>
             </w:pPr>
             <w:r>
-              <w:t xml:space="preserve">Writing style skills (sciwrite, Noora humanizer, academic/medical skills)</w:t>
+              <w:t xml:space="preserve">Writing style skills (sciwrite, Noora humanizer, academic/medical skill packs)</w:t>
             </w:r>
           </w:p>
         </w:tc>
@@ -619,7 +670,7 @@
               <w:pStyle w:val="Compact"/>
             </w:pPr>
             <w:r>
-              <w:t xml:space="preserve">APA templates &amp; statistical terminology guides</w:t>
+              <w:t xml:space="preserve">Thesis &amp; academic packs (academic-writing, language-refinement, thesis-discussion-writer, Thesis_guide)</w:t>
             </w:r>
           </w:p>
         </w:tc>
@@ -633,7 +684,7 @@
               <w:rPr>
                 <w:rStyle w:val="VerbatimChar"/>
               </w:rPr>
-              <w:t xml:space="preserve">meddraft_ai/templates/</w:t>
+              <w:t xml:space="preserve">meddraft_ai/prompts/</w:t>
             </w:r>
           </w:p>
         </w:tc>
@@ -646,7 +697,19 @@
               <w:pStyle w:val="Compact"/>
             </w:pPr>
             <w:r>
-              <w:t xml:space="preserve">Journal formatting (MDPI, Elsevier)</w:t>
+              <w:t xml:space="preserve">Agent guard skills + Cairo thesis compliance (pinned in</w:t>
+            </w:r>
+            <w:r>
+              <w:t xml:space="preserve"> </w:t>
+            </w:r>
+            <w:r>
+              <w:rPr>
+                <w:rStyle w:val="VerbatimChar"/>
+              </w:rPr>
+              <w:t xml:space="preserve">skills-lock.json</w:t>
+            </w:r>
+            <w:r>
+              <w:t xml:space="preserve">)</w:t>
             </w:r>
           </w:p>
         </w:tc>
@@ -660,7 +723,7 @@
               <w:rPr>
                 <w:rStyle w:val="VerbatimChar"/>
               </w:rPr>
-              <w:t xml:space="preserve">meddraft_ai/export/formatting_tools/formatting_tools/format_journal_cli.py</w:t>
+              <w:t xml:space="preserve">.agents/skills/</w:t>
             </w:r>
           </w:p>
         </w:tc>
@@ -673,7 +736,7 @@
               <w:pStyle w:val="Compact"/>
             </w:pPr>
             <w:r>
-              <w:t xml:space="preserve">DOCX export (Pandoc / python-docx)</w:t>
+              <w:t xml:space="preserve">APA templates &amp; statistical terminology guides</w:t>
             </w:r>
           </w:p>
         </w:tc>
@@ -687,7 +750,7 @@
               <w:rPr>
                 <w:rStyle w:val="VerbatimChar"/>
               </w:rPr>
-              <w:t xml:space="preserve">meddraft_ai/export/pandoc_converter.py</w:t>
+              <w:t xml:space="preserve">meddraft_ai/templates/</w:t>
             </w:r>
           </w:p>
         </w:tc>
@@ -700,7 +763,7 @@
               <w:pStyle w:val="Compact"/>
             </w:pPr>
             <w:r>
-              <w:t xml:space="preserve">Default output folder</w:t>
+              <w:t xml:space="preserve">Journal formatting (MDPI, Elsevier)</w:t>
             </w:r>
           </w:p>
         </w:tc>
@@ -714,6 +777,60 @@
               <w:rPr>
                 <w:rStyle w:val="VerbatimChar"/>
               </w:rPr>
+              <w:t xml:space="preserve">meddraft_ai/export/formatting_tools/formatting_tools/format_journal_cli.py</w:t>
+            </w:r>
+          </w:p>
+        </w:tc>
+      </w:tr>
+      <w:tr>
+        <w:tc>
+          <w:tcPr/>
+          <w:p>
+            <w:pPr>
+              <w:pStyle w:val="Compact"/>
+            </w:pPr>
+            <w:r>
+              <w:t xml:space="preserve">DOCX export (Pandoc / python-docx)</w:t>
+            </w:r>
+          </w:p>
+        </w:tc>
+        <w:tc>
+          <w:tcPr/>
+          <w:p>
+            <w:pPr>
+              <w:pStyle w:val="Compact"/>
+            </w:pPr>
+            <w:r>
+              <w:rPr>
+                <w:rStyle w:val="VerbatimChar"/>
+              </w:rPr>
+              <w:t xml:space="preserve">meddraft_ai/export/pandoc_converter.py</w:t>
+            </w:r>
+          </w:p>
+        </w:tc>
+      </w:tr>
+      <w:tr>
+        <w:tc>
+          <w:tcPr/>
+          <w:p>
+            <w:pPr>
+              <w:pStyle w:val="Compact"/>
+            </w:pPr>
+            <w:r>
+              <w:t xml:space="preserve">Default output folder</w:t>
+            </w:r>
+          </w:p>
+        </w:tc>
+        <w:tc>
+          <w:tcPr/>
+          <w:p>
+            <w:pPr>
+              <w:pStyle w:val="Compact"/>
+            </w:pPr>
+            <w:r>
+              <w:rPr>
+                <w:rStyle w:val="VerbatimChar"/>
+              </w:rPr>
               <w:t xml:space="preserve">outputs/</w:t>
             </w:r>
           </w:p>
@@ -865,7 +982,7 @@
         <w:t xml:space="preserve">SCIENCEDIRECT_API_KEY</w:t>
       </w:r>
       <w:r>
-        <w:t xml:space="preserve">, …).</w:t>
+        <w:t xml:space="preserve">, ...).</w:t>
       </w:r>
     </w:p>
     <w:p>
@@ -878,7 +995,7 @@
     <w:bookmarkEnd w:id="9"/>
     <w:bookmarkEnd w:id="10"/>
     <w:bookmarkEnd w:id="11"/>
-    <w:bookmarkStart w:id="12" w:name="Xdd8ec16765becb9eedc6663ad05f00306ab6a5d"/>
+    <w:bookmarkStart w:id="12" w:name="Xbd771f6e56bd4131e4d23a5eceae39c8147449f"/>
     <w:p>
       <w:pPr>
         <w:pStyle w:val="Heading1"/>
@@ -1134,25 +1251,25 @@
         <w:rPr>
           <w:rStyle w:val="VerbatimChar"/>
         </w:rPr>
-        <w:t xml:space="preserve">SYSTEM ROLE &amp; PERSONA</w:t>
-      </w:r>
-      <w:r>
-        <w:br/>
-      </w:r>
-      <w:r>
-        <w:rPr>
-          <w:rStyle w:val="VerbatimChar"/>
-        </w:rPr>
-        <w:t xml:space="preserve">Act like an expert academic medical editor, clinical researcher, and evidence-verification</w:t>
-      </w:r>
-      <w:r>
-        <w:br/>
-      </w:r>
-      <w:r>
-        <w:rPr>
-          <w:rStyle w:val="VerbatimChar"/>
-        </w:rPr>
-        <w:t xml:space="preserve">agent running inside the MedDraft_AI platform. You are powered by the extraction and</w:t>
+        <w:t xml:space="preserve">&lt;ROLE&gt;</w:t>
+      </w:r>
+      <w:r>
+        <w:br/>
+      </w:r>
+      <w:r>
+        <w:rPr>
+          <w:rStyle w:val="VerbatimChar"/>
+        </w:rPr>
+        <w:t xml:space="preserve">You are an expert academic medical editor, clinical researcher, and evidence-verification</w:t>
+      </w:r>
+      <w:r>
+        <w:br/>
+      </w:r>
+      <w:r>
+        <w:rPr>
+          <w:rStyle w:val="VerbatimChar"/>
+        </w:rPr>
+        <w:t xml:space="preserve">agent operating inside the MedDraft_AI platform. You are powered by the extraction and</w:t>
       </w:r>
       <w:r>
         <w:br/>
@@ -1170,34 +1287,34 @@
         <w:rPr>
           <w:rStyle w:val="VerbatimChar"/>
         </w:rPr>
-        <w:t xml:space="preserve">- `pdf_reader.py`  → PDFReader.read_text() (page-marked plain text)</w:t>
-      </w:r>
-      <w:r>
-        <w:br/>
-      </w:r>
-      <w:r>
-        <w:rPr>
-          <w:rStyle w:val="VerbatimChar"/>
-        </w:rPr>
-        <w:t xml:space="preserve">- `converter.py`   → DocumentConverterEngine (Docling PDF→Markdown with OCR, tables, figures)</w:t>
-      </w:r>
-      <w:r>
-        <w:br/>
-      </w:r>
-      <w:r>
-        <w:rPr>
-          <w:rStyle w:val="VerbatimChar"/>
-        </w:rPr>
-        <w:t xml:space="preserve">- `extraction_engine.py` → ExtractionEngine.extract_text_and_citations()</w:t>
-      </w:r>
-      <w:r>
-        <w:br/>
-      </w:r>
-      <w:r>
-        <w:rPr>
-          <w:rStyle w:val="VerbatimChar"/>
-        </w:rPr>
-        <w:t xml:space="preserve">- `citation_tracker.py`  → CitationVerifier.verify_doi / verify_pmid / extract_and_verify</w:t>
+        <w:t xml:space="preserve">- `pdf_reader.py`         → PDFReader.read_text() (page-marked plain text)</w:t>
+      </w:r>
+      <w:r>
+        <w:br/>
+      </w:r>
+      <w:r>
+        <w:rPr>
+          <w:rStyle w:val="VerbatimChar"/>
+        </w:rPr>
+        <w:t xml:space="preserve">- `converter.py`          → DocumentConverterEngine (Docling PDF→Markdown with OCR, tables, figures)</w:t>
+      </w:r>
+      <w:r>
+        <w:br/>
+      </w:r>
+      <w:r>
+        <w:rPr>
+          <w:rStyle w:val="VerbatimChar"/>
+        </w:rPr>
+        <w:t xml:space="preserve">- `extraction_engine.py`  → ExtractionEngine.extract_text_and_citations()</w:t>
+      </w:r>
+      <w:r>
+        <w:br/>
+      </w:r>
+      <w:r>
+        <w:rPr>
+          <w:rStyle w:val="VerbatimChar"/>
+        </w:rPr>
+        <w:t xml:space="preserve">- `citation_tracker.py`   → CitationVerifier.verify_doi / verify_pmid / extract_and_verify</w:t>
       </w:r>
       <w:r>
         <w:br/>
@@ -1212,31 +1329,97 @@
         <w:br/>
       </w:r>
       <w:r>
-        <w:br/>
-      </w:r>
-      <w:r>
-        <w:rPr>
-          <w:rStyle w:val="VerbatimChar"/>
-        </w:rPr>
-        <w:t xml:space="preserve">OBJECTIVE</w:t>
-      </w:r>
-      <w:r>
-        <w:br/>
-      </w:r>
-      <w:r>
-        <w:rPr>
-          <w:rStyle w:val="VerbatimChar"/>
-        </w:rPr>
-        <w:t xml:space="preserve">Rigorously correct fabricated data, factual inaccuracies, and misrepresentations in a</w:t>
-      </w:r>
-      <w:r>
-        <w:br/>
-      </w:r>
-      <w:r>
-        <w:rPr>
-          <w:rStyle w:val="VerbatimChar"/>
-        </w:rPr>
-        <w:t xml:space="preserve">provided Discussion paragraph so it matches exactly the verified content of the authorized</w:t>
+        <w:rPr>
+          <w:rStyle w:val="VerbatimChar"/>
+        </w:rPr>
+        <w:t xml:space="preserve">&lt;/ROLE&gt;</w:t>
+      </w:r>
+      <w:r>
+        <w:br/>
+      </w:r>
+      <w:r>
+        <w:br/>
+      </w:r>
+      <w:r>
+        <w:rPr>
+          <w:rStyle w:val="VerbatimChar"/>
+        </w:rPr>
+        <w:t xml:space="preserve">&lt;INPUTS&gt;</w:t>
+      </w:r>
+      <w:r>
+        <w:br/>
+      </w:r>
+      <w:r>
+        <w:rPr>
+          <w:rStyle w:val="VerbatimChar"/>
+        </w:rPr>
+        <w:t xml:space="preserve">TARGET_DISCUSSION_PARAGRAPH: [PASTE_THE_DISCUSSION_PARAGRAPH_TO_CORRECT_HERE]</w:t>
+      </w:r>
+      <w:r>
+        <w:br/>
+      </w:r>
+      <w:r>
+        <w:rPr>
+          <w:rStyle w:val="VerbatimChar"/>
+        </w:rPr>
+        <w:t xml:space="preserve">EXTERNAL_STUDIES_DIRECTORY: [INSERT_EXTERNAL_STUDIES_DIRECTORY_PATH]</w:t>
+      </w:r>
+      <w:r>
+        <w:br/>
+      </w:r>
+      <w:r>
+        <w:rPr>
+          <w:rStyle w:val="VerbatimChar"/>
+        </w:rPr>
+        <w:t xml:space="preserve">NUMBER_OF_EXTERNAL_PDFS: [INSERT_NUMBER]</w:t>
+      </w:r>
+      <w:r>
+        <w:br/>
+      </w:r>
+      <w:r>
+        <w:rPr>
+          <w:rStyle w:val="VerbatimChar"/>
+        </w:rPr>
+        <w:t xml:space="preserve">RESULTS_FILE_PATH: [INSERT_RESULTS_FILE_PATH]</w:t>
+      </w:r>
+      <w:r>
+        <w:br/>
+      </w:r>
+      <w:r>
+        <w:rPr>
+          <w:rStyle w:val="VerbatimChar"/>
+        </w:rPr>
+        <w:t xml:space="preserve">&lt;/INPUTS&gt;</w:t>
+      </w:r>
+      <w:r>
+        <w:br/>
+      </w:r>
+      <w:r>
+        <w:br/>
+      </w:r>
+      <w:r>
+        <w:rPr>
+          <w:rStyle w:val="VerbatimChar"/>
+        </w:rPr>
+        <w:t xml:space="preserve">&lt;OBJECTIVE&gt;</w:t>
+      </w:r>
+      <w:r>
+        <w:br/>
+      </w:r>
+      <w:r>
+        <w:rPr>
+          <w:rStyle w:val="VerbatimChar"/>
+        </w:rPr>
+        <w:t xml:space="preserve">Rigorously correct fabricated data, factual inaccuracies, and misrepresentations in</w:t>
+      </w:r>
+      <w:r>
+        <w:br/>
+      </w:r>
+      <w:r>
+        <w:rPr>
+          <w:rStyle w:val="VerbatimChar"/>
+        </w:rPr>
+        <w:t xml:space="preserve">TARGET_DISCUSSION_PARAGRAPH so it matches exactly the verified content of the authorized</w:t>
       </w:r>
       <w:r>
         <w:br/>
@@ -1269,70 +1452,124 @@
         <w:br/>
       </w:r>
       <w:r>
-        <w:br/>
-      </w:r>
-      <w:r>
-        <w:rPr>
-          <w:rStyle w:val="VerbatimChar"/>
-        </w:rPr>
-        <w:t xml:space="preserve">AUTHORIZED DATA SOURCES (treat as the ONLY authoritative sources in existence)</w:t>
-      </w:r>
-      <w:r>
-        <w:br/>
-      </w:r>
-      <w:r>
-        <w:rPr>
-          <w:rStyle w:val="VerbatimChar"/>
-        </w:rPr>
-        <w:t xml:space="preserve">- [INSERT_NUMBER] external study PDF(s) located at: [INSERT_EXTERNAL_STUDIES_DIRECTORY_PATH]</w:t>
-      </w:r>
-      <w:r>
-        <w:br/>
-      </w:r>
-      <w:r>
-        <w:rPr>
-          <w:rStyle w:val="VerbatimChar"/>
-        </w:rPr>
-        <w:t xml:space="preserve">- The User's Results File located at: [INSERT_RESULTS_FILE_PATH]</w:t>
-      </w:r>
-      <w:r>
-        <w:br/>
-      </w:r>
-      <w:r>
-        <w:br/>
-      </w:r>
-      <w:r>
-        <w:rPr>
-          <w:rStyle w:val="VerbatimChar"/>
-        </w:rPr>
-        <w:t xml:space="preserve">TASK (STEP-BY-STEP)</w:t>
-      </w:r>
-      <w:r>
-        <w:br/>
-      </w:r>
-      <w:r>
-        <w:rPr>
-          <w:rStyle w:val="VerbatimChar"/>
-        </w:rPr>
-        <w:t xml:space="preserve">1. EXECUTE EXTRACTION: Read the external full-text PDFs using the MedDraft_AI extraction</w:t>
-      </w:r>
-      <w:r>
-        <w:br/>
-      </w:r>
-      <w:r>
-        <w:rPr>
-          <w:rStyle w:val="VerbatimChar"/>
-        </w:rPr>
-        <w:t xml:space="preserve">   pipeline (PDFReader / ExtractionEngine / DocumentConverterEngine). Preserve page markers</w:t>
-      </w:r>
-      <w:r>
-        <w:br/>
-      </w:r>
-      <w:r>
-        <w:rPr>
-          <w:rStyle w:val="VerbatimChar"/>
-        </w:rPr>
-        <w:t xml:space="preserve">   and tables. Do NOT use any other knowledge.</w:t>
+        <w:rPr>
+          <w:rStyle w:val="VerbatimChar"/>
+        </w:rPr>
+        <w:t xml:space="preserve">&lt;/OBJECTIVE&gt;</w:t>
+      </w:r>
+      <w:r>
+        <w:br/>
+      </w:r>
+      <w:r>
+        <w:br/>
+      </w:r>
+      <w:r>
+        <w:rPr>
+          <w:rStyle w:val="VerbatimChar"/>
+        </w:rPr>
+        <w:t xml:space="preserve">&lt;CAPABILITY_GUARD&gt;</w:t>
+      </w:r>
+      <w:r>
+        <w:br/>
+      </w:r>
+      <w:r>
+        <w:rPr>
+          <w:rStyle w:val="VerbatimChar"/>
+        </w:rPr>
+        <w:t xml:space="preserve">- If you have file and code access, execute the extraction modules as specified below.</w:t>
+      </w:r>
+      <w:r>
+        <w:br/>
+      </w:r>
+      <w:r>
+        <w:rPr>
+          <w:rStyle w:val="VerbatimChar"/>
+        </w:rPr>
+        <w:t xml:space="preserve">- If you do NOT have file access, STOP and reply only: "I need the page-marked text of</w:t>
+      </w:r>
+      <w:r>
+        <w:br/>
+      </w:r>
+      <w:r>
+        <w:rPr>
+          <w:rStyle w:val="VerbatimChar"/>
+        </w:rPr>
+        <w:t xml:space="preserve">  the NUMBER_OF_EXTERNAL_PDFS PDF(s) and the results file pasted here before I can</w:t>
+      </w:r>
+      <w:r>
+        <w:br/>
+      </w:r>
+      <w:r>
+        <w:rPr>
+          <w:rStyle w:val="VerbatimChar"/>
+        </w:rPr>
+        <w:t xml:space="preserve">  verify anything." Never simulate, summarize from memory, or pretend an extraction</w:t>
+      </w:r>
+      <w:r>
+        <w:br/>
+      </w:r>
+      <w:r>
+        <w:rPr>
+          <w:rStyle w:val="VerbatimChar"/>
+        </w:rPr>
+        <w:t xml:space="preserve">  ran — a correction made without the sources is fabrication.</w:t>
+      </w:r>
+      <w:r>
+        <w:br/>
+      </w:r>
+      <w:r>
+        <w:rPr>
+          <w:rStyle w:val="VerbatimChar"/>
+        </w:rPr>
+        <w:t xml:space="preserve">&lt;/CAPABILITY_GUARD&gt;</w:t>
+      </w:r>
+      <w:r>
+        <w:br/>
+      </w:r>
+      <w:r>
+        <w:br/>
+      </w:r>
+      <w:r>
+        <w:rPr>
+          <w:rStyle w:val="VerbatimChar"/>
+        </w:rPr>
+        <w:t xml:space="preserve">&lt;TASK (STEP-BY-STEP)&gt;</w:t>
+      </w:r>
+      <w:r>
+        <w:br/>
+      </w:r>
+      <w:r>
+        <w:rPr>
+          <w:rStyle w:val="VerbatimChar"/>
+        </w:rPr>
+        <w:t xml:space="preserve">1. EXECUTE EXTRACTION: Read the external full-text PDFs in EXTERNAL_STUDIES_DIRECTORY</w:t>
+      </w:r>
+      <w:r>
+        <w:br/>
+      </w:r>
+      <w:r>
+        <w:rPr>
+          <w:rStyle w:val="VerbatimChar"/>
+        </w:rPr>
+        <w:t xml:space="preserve">   using the MedDraft_AI extraction pipeline (PDFReader / ExtractionEngine /</w:t>
+      </w:r>
+      <w:r>
+        <w:br/>
+      </w:r>
+      <w:r>
+        <w:rPr>
+          <w:rStyle w:val="VerbatimChar"/>
+        </w:rPr>
+        <w:t xml:space="preserve">   DocumentConverterEngine). Preserve page markers and tables. Do NOT use any other</w:t>
+      </w:r>
+      <w:r>
+        <w:br/>
+      </w:r>
+      <w:r>
+        <w:rPr>
+          <w:rStyle w:val="VerbatimChar"/>
+        </w:rPr>
+        <w:t xml:space="preserve">   knowledge.</w:t>
       </w:r>
       <w:r>
         <w:br/>
@@ -1368,25 +1605,25 @@
         <w:rPr>
           <w:rStyle w:val="VerbatimChar"/>
         </w:rPr>
-        <w:t xml:space="preserve">3. ANALYZE TARGET TEXT: Identify every factual claim in the target paragraph (sample size,</w:t>
-      </w:r>
-      <w:r>
-        <w:br/>
-      </w:r>
-      <w:r>
-        <w:rPr>
-          <w:rStyle w:val="VerbatimChar"/>
-        </w:rPr>
-        <w:t xml:space="preserve">   patient characteristics, study design, methods, techniques, outcomes, statistics,</w:t>
-      </w:r>
-      <w:r>
-        <w:br/>
-      </w:r>
-      <w:r>
-        <w:rPr>
-          <w:rStyle w:val="VerbatimChar"/>
-        </w:rPr>
-        <w:t xml:space="preserve">   p-values, subgroup definitions).</w:t>
+        <w:t xml:space="preserve">3. ANALYZE TARGET TEXT: Identify every factual claim in TARGET_DISCUSSION_PARAGRAPH</w:t>
+      </w:r>
+      <w:r>
+        <w:br/>
+      </w:r>
+      <w:r>
+        <w:rPr>
+          <w:rStyle w:val="VerbatimChar"/>
+        </w:rPr>
+        <w:t xml:space="preserve">   (sample size, patient characteristics, study design, methods, techniques, outcomes,</w:t>
+      </w:r>
+      <w:r>
+        <w:br/>
+      </w:r>
+      <w:r>
+        <w:rPr>
+          <w:rStyle w:val="VerbatimChar"/>
+        </w:rPr>
+        <w:t xml:space="preserve">   statistics, p-values, subgroup definitions).</w:t>
       </w:r>
       <w:r>
         <w:br/>
@@ -1404,7 +1641,7 @@
         <w:rPr>
           <w:rStyle w:val="VerbatimChar"/>
         </w:rPr>
-        <w:t xml:space="preserve">   by the extracted PDF data or the user results file.</w:t>
+        <w:t xml:space="preserve">   by the extracted PDF data or the results file, and by which page/table.</w:t>
       </w:r>
       <w:r>
         <w:br/>
@@ -1422,7 +1659,7 @@
         <w:rPr>
           <w:rStyle w:val="VerbatimChar"/>
         </w:rPr>
-        <w:t xml:space="preserve">   as [Unverified].</w:t>
+        <w:t xml:space="preserve">   as [Unverified] in the verification table (see OUTPUT_FORMAT).</w:t>
       </w:r>
       <w:r>
         <w:br/>
@@ -1521,37 +1758,19 @@
         <w:rPr>
           <w:rStyle w:val="VerbatimChar"/>
         </w:rPr>
-        <w:t xml:space="preserve">8. FINAL OUTPUT: Rewrite the corrected paragraph in formal academic scientific style</w:t>
-      </w:r>
-      <w:r>
-        <w:br/>
-      </w:r>
-      <w:r>
-        <w:rPr>
-          <w:rStyle w:val="VerbatimChar"/>
-        </w:rPr>
-        <w:t xml:space="preserve">   (paragraph format, not bullets). Clearly state whether each cited study aligns with or</w:t>
-      </w:r>
-      <w:r>
-        <w:br/>
-      </w:r>
-      <w:r>
-        <w:rPr>
-          <w:rStyle w:val="VerbatimChar"/>
-        </w:rPr>
-        <w:t xml:space="preserve">   contrasts the user's study findings.</w:t>
-      </w:r>
-      <w:r>
-        <w:br/>
-      </w:r>
-      <w:r>
-        <w:br/>
-      </w:r>
-      <w:r>
-        <w:rPr>
-          <w:rStyle w:val="VerbatimChar"/>
-        </w:rPr>
-        <w:t xml:space="preserve">ZERO-HALLUCINATION GUARANTEE &amp; CONTROL RULES (MANDATORY)</w:t>
+        <w:t xml:space="preserve">&lt;/TASK&gt;</w:t>
+      </w:r>
+      <w:r>
+        <w:br/>
+      </w:r>
+      <w:r>
+        <w:br/>
+      </w:r>
+      <w:r>
+        <w:rPr>
+          <w:rStyle w:val="VerbatimChar"/>
+        </w:rPr>
+        <w:t xml:space="preserve">&lt;ZERO_HALLUCINATION_RULES (MANDATORY)&gt;</w:t>
       </w:r>
       <w:r>
         <w:br/>
@@ -1569,16 +1788,25 @@
         <w:rPr>
           <w:rStyle w:val="VerbatimChar"/>
         </w:rPr>
-        <w:t xml:space="preserve">  MUST be traceable to the extracted PDFs or the user results file.</w:t>
-      </w:r>
-      <w:r>
-        <w:br/>
-      </w:r>
-      <w:r>
-        <w:rPr>
-          <w:rStyle w:val="VerbatimChar"/>
-        </w:rPr>
-        <w:t xml:space="preserve">- Citation Anchors: Every data point must carry a precise CitationAnchor tag.</w:t>
+        <w:t xml:space="preserve">  MUST be traceable to the extracted PDFs or the results file.</w:t>
+      </w:r>
+      <w:r>
+        <w:br/>
+      </w:r>
+      <w:r>
+        <w:rPr>
+          <w:rStyle w:val="VerbatimChar"/>
+        </w:rPr>
+        <w:t xml:space="preserve">- Citation Anchors: Every data point in the corrected paragraph must carry a precise</w:t>
+      </w:r>
+      <w:r>
+        <w:br/>
+      </w:r>
+      <w:r>
+        <w:rPr>
+          <w:rStyle w:val="VerbatimChar"/>
+        </w:rPr>
+        <w:t xml:space="preserve">  CitationAnchor tag.</w:t>
       </w:r>
       <w:r>
         <w:br/>
@@ -1605,34 +1833,7 @@
         <w:rPr>
           <w:rStyle w:val="VerbatimChar"/>
         </w:rPr>
-        <w:t xml:space="preserve">- Labeling: Prefix unverified content with [Unverified], [Inference], or [Speculation].</w:t>
-      </w:r>
-      <w:r>
-        <w:br/>
-      </w:r>
-      <w:r>
-        <w:rPr>
-          <w:rStyle w:val="VerbatimChar"/>
-        </w:rPr>
-        <w:t xml:space="preserve">- Global Flag: If any single element cannot be verified via the extraction pipeline, label</w:t>
-      </w:r>
-      <w:r>
-        <w:br/>
-      </w:r>
-      <w:r>
-        <w:rPr>
-          <w:rStyle w:val="VerbatimChar"/>
-        </w:rPr>
-        <w:t xml:space="preserve">  the entire response as [Unverified].</w:t>
-      </w:r>
-      <w:r>
-        <w:br/>
-      </w:r>
-      <w:r>
-        <w:rPr>
-          <w:rStyle w:val="VerbatimChar"/>
-        </w:rPr>
-        <w:t xml:space="preserve">- Missing Data Protocol: If verification is impossible, state exactly:</w:t>
+        <w:t xml:space="preserve">- Missing Data Protocol: If a claim cannot be verified, state exactly:</w:t>
       </w:r>
       <w:r>
         <w:br/>
@@ -1668,73 +1869,118 @@
         <w:rPr>
           <w:rStyle w:val="VerbatimChar"/>
         </w:rPr>
-        <w:t xml:space="preserve">- Internal Audit: Before finalizing, confirm every numeric value maps directly to the</w:t>
-      </w:r>
-      <w:r>
-        <w:br/>
-      </w:r>
-      <w:r>
-        <w:rPr>
-          <w:rStyle w:val="VerbatimChar"/>
-        </w:rPr>
-        <w:t xml:space="preserve">  extract_pdf_data output tables.</w:t>
-      </w:r>
-      <w:r>
-        <w:br/>
-      </w:r>
-      <w:r>
-        <w:br/>
-      </w:r>
-      <w:r>
-        <w:rPr>
-          <w:rStyle w:val="VerbatimChar"/>
-        </w:rPr>
-        <w:t xml:space="preserve">OUTPUT CONSTRAINTS</w:t>
-      </w:r>
-      <w:r>
-        <w:br/>
-      </w:r>
-      <w:r>
-        <w:rPr>
-          <w:rStyle w:val="VerbatimChar"/>
-        </w:rPr>
-        <w:t xml:space="preserve">- Format: Academic paragraphs only.</w:t>
-      </w:r>
-      <w:r>
-        <w:br/>
-      </w:r>
-      <w:r>
-        <w:rPr>
-          <w:rStyle w:val="VerbatimChar"/>
-        </w:rPr>
-        <w:t xml:space="preserve">- Tone: Scientific, neutral, precise.</w:t>
-      </w:r>
-      <w:r>
-        <w:br/>
-      </w:r>
-      <w:r>
-        <w:rPr>
-          <w:rStyle w:val="VerbatimChar"/>
-        </w:rPr>
-        <w:t xml:space="preserve">- Scope: Include only verified data from the designated local directory.</w:t>
-      </w:r>
-      <w:r>
-        <w:br/>
-      </w:r>
-      <w:r>
-        <w:rPr>
-          <w:rStyle w:val="VerbatimChar"/>
-        </w:rPr>
-        <w:t xml:space="preserve">- Execution: Think step-by-step internally (analyzing extraction logs), but output ONLY the</w:t>
-      </w:r>
-      <w:r>
-        <w:br/>
-      </w:r>
-      <w:r>
-        <w:rPr>
-          <w:rStyle w:val="VerbatimChar"/>
-        </w:rPr>
-        <w:t xml:space="preserve">  final corrected paragraph(s) containing the CitationAnchors.</w:t>
+        <w:t xml:space="preserve">- Internal Audit: Before finalizing, confirm every numeric value in the corrected</w:t>
+      </w:r>
+      <w:r>
+        <w:br/>
+      </w:r>
+      <w:r>
+        <w:rPr>
+          <w:rStyle w:val="VerbatimChar"/>
+        </w:rPr>
+        <w:t xml:space="preserve">  paragraph maps directly to the extraction output tables.</w:t>
+      </w:r>
+      <w:r>
+        <w:br/>
+      </w:r>
+      <w:r>
+        <w:rPr>
+          <w:rStyle w:val="VerbatimChar"/>
+        </w:rPr>
+        <w:t xml:space="preserve">&lt;/ZERO_HALLUCINATION_RULES&gt;</w:t>
+      </w:r>
+      <w:r>
+        <w:br/>
+      </w:r>
+      <w:r>
+        <w:br/>
+      </w:r>
+      <w:r>
+        <w:rPr>
+          <w:rStyle w:val="VerbatimChar"/>
+        </w:rPr>
+        <w:t xml:space="preserve">&lt;OUTPUT_FORMAT (in this exact order)&gt;</w:t>
+      </w:r>
+      <w:r>
+        <w:br/>
+      </w:r>
+      <w:r>
+        <w:rPr>
+          <w:rStyle w:val="VerbatimChar"/>
+        </w:rPr>
+        <w:t xml:space="preserve">1. CLAIM VERIFICATION TABLE — one row per factual claim in TARGET_DISCUSSION_PARAGRAPH:</w:t>
+      </w:r>
+      <w:r>
+        <w:br/>
+      </w:r>
+      <w:r>
+        <w:rPr>
+          <w:rStyle w:val="VerbatimChar"/>
+        </w:rPr>
+        <w:t xml:space="preserve">   claim | status (Verified / [Unverified]) | source (PDF page/table or results file).</w:t>
+      </w:r>
+      <w:r>
+        <w:br/>
+      </w:r>
+      <w:r>
+        <w:rPr>
+          <w:rStyle w:val="VerbatimChar"/>
+        </w:rPr>
+        <w:t xml:space="preserve">2. CORRECTED PARAGRAPH(S) — formal academic scientific style (paragraphs, not bullets),</w:t>
+      </w:r>
+      <w:r>
+        <w:br/>
+      </w:r>
+      <w:r>
+        <w:rPr>
+          <w:rStyle w:val="VerbatimChar"/>
+        </w:rPr>
+        <w:t xml:space="preserve">   with an inline CitationAnchor on every surviving data point. Claims that could not be</w:t>
+      </w:r>
+      <w:r>
+        <w:br/>
+      </w:r>
+      <w:r>
+        <w:rPr>
+          <w:rStyle w:val="VerbatimChar"/>
+        </w:rPr>
+        <w:t xml:space="preserve">   verified are removed from the paragraph (they stay visible in the table above) — a</w:t>
+      </w:r>
+      <w:r>
+        <w:br/>
+      </w:r>
+      <w:r>
+        <w:rPr>
+          <w:rStyle w:val="VerbatimChar"/>
+        </w:rPr>
+        <w:t xml:space="preserve">   correction that keeps an unverifiable number with a flag is not a correction.</w:t>
+      </w:r>
+      <w:r>
+        <w:br/>
+      </w:r>
+      <w:r>
+        <w:rPr>
+          <w:rStyle w:val="VerbatimChar"/>
+        </w:rPr>
+        <w:t xml:space="preserve">3. VERIFICATION SUMMARY — one line: N claims checked, M verified, K removed/corrected,</w:t>
+      </w:r>
+      <w:r>
+        <w:br/>
+      </w:r>
+      <w:r>
+        <w:rPr>
+          <w:rStyle w:val="VerbatimChar"/>
+        </w:rPr>
+        <w:t xml:space="preserve">   sources used.</w:t>
+      </w:r>
+      <w:r>
+        <w:br/>
+      </w:r>
+      <w:r>
+        <w:rPr>
+          <w:rStyle w:val="VerbatimChar"/>
+        </w:rPr>
+        <w:t xml:space="preserve">&lt;/OUTPUT_FORMAT&gt;</w:t>
       </w:r>
     </w:p>
     <w:p>
@@ -1748,11 +1994,17 @@
         </w:rPr>
         <w:t xml:space="preserve">Beginner tips</w:t>
       </w:r>
-      <w:r>
-        <w:t xml:space="preserve"> </w:t>
-      </w:r>
-      <w:r>
-        <w:t xml:space="preserve">- Put the PDFs and your results file inside</w:t>
+    </w:p>
+    <w:p>
+      <w:pPr>
+        <w:pStyle w:val="Compact"/>
+        <w:numPr>
+          <w:ilvl w:val="0"/>
+          <w:numId w:val="1002"/>
+        </w:numPr>
+      </w:pPr>
+      <w:r>
+        <w:t xml:space="preserve">Put the PDFs and your results file inside</w:t>
       </w:r>
       <w:r>
         <w:t xml:space="preserve"> </w:t>
@@ -1767,25 +2019,34 @@
         <w:t xml:space="preserve"> </w:t>
       </w:r>
       <w:r>
-        <w:t xml:space="preserve">first; the prompt cannot read files that don’t exist.</w:t>
-      </w:r>
-      <w:r>
-        <w:t xml:space="preserve"> </w:t>
-      </w:r>
-      <w:r>
-        <w:t xml:space="preserve">- If a claim says</w:t>
-      </w:r>
-      <w:r>
-        <w:t xml:space="preserve"> </w:t>
-      </w:r>
-      <w:r>
-        <w:t xml:space="preserve">“results were significant”</w:t>
-      </w:r>
-      <w:r>
-        <w:t xml:space="preserve"> </w:t>
-      </w:r>
-      <w:r>
-        <w:t xml:space="preserve">but no p-value is in the PDF, the agent must flag it</w:t>
+        <w:t xml:space="preserve">first, and paste the actual paragraph into</w:t>
+      </w:r>
+      <w:r>
+        <w:t xml:space="preserve"> </w:t>
+      </w:r>
+      <w:r>
+        <w:rPr>
+          <w:rStyle w:val="VerbatimChar"/>
+        </w:rPr>
+        <w:t xml:space="preserve">TARGET_DISCUSSION_PARAGRAPH</w:t>
+      </w:r>
+      <w:r>
+        <w:t xml:space="preserve"> </w:t>
+      </w:r>
+      <w:r>
+        <w:t xml:space="preserve">— the agent cannot correct text it cannot see.</w:t>
+      </w:r>
+    </w:p>
+    <w:p>
+      <w:pPr>
+        <w:pStyle w:val="Compact"/>
+        <w:numPr>
+          <w:ilvl w:val="0"/>
+          <w:numId w:val="1002"/>
+        </w:numPr>
+      </w:pPr>
+      <w:r>
+        <w:t xml:space="preserve">If a claim says "results were significant" but no p-value is in the PDF, the claim appears as</w:t>
       </w:r>
       <w:r>
         <w:t xml:space="preserve"> </w:t>
@@ -1800,7 +2061,7 @@
         <w:t xml:space="preserve"> </w:t>
       </w:r>
       <w:r>
-        <w:t xml:space="preserve">— that is correct behavior.</w:t>
+        <w:t xml:space="preserve">in the verification table and is removed from the corrected paragraph — that is correct behavior, not a failure.</w:t>
       </w:r>
     </w:p>
     <w:p>
@@ -1811,7 +2072,7 @@
       </w:r>
     </w:p>
     <w:bookmarkEnd w:id="12"/>
-    <w:bookmarkStart w:id="13" w:name="X2b8b3a024a953f69eddd81494e39a9526f139c4"/>
+    <w:bookmarkStart w:id="13" w:name="X26c683370628aa9101040d6fdd9131d449db8f2"/>
     <w:p>
       <w:pPr>
         <w:pStyle w:val="Heading1"/>
@@ -1856,10 +2117,28 @@
         <w:rPr>
           <w:rStyle w:val="VerbatimChar"/>
         </w:rPr>
-        <w:t xml:space="preserve">main.py --type thesis --humanize --pdf-input</w:t>
-      </w:r>
-      <w:r>
-        <w:t xml:space="preserve">, writing skills in</w:t>
+        <w:t xml:space="preserve">main.py --type thesis --humanize --project-dir</w:t>
+      </w:r>
+      <w:r>
+        <w:t xml:space="preserve"> </w:t>
+      </w:r>
+      <w:r>
+        <w:t xml:space="preserve">(source-grounded Discussion mode;</w:t>
+      </w:r>
+      <w:r>
+        <w:t xml:space="preserve"> </w:t>
+      </w:r>
+      <w:r>
+        <w:rPr>
+          <w:rStyle w:val="VerbatimChar"/>
+        </w:rPr>
+        <w:t xml:space="preserve">--pdf-input</w:t>
+      </w:r>
+      <w:r>
+        <w:t xml:space="preserve"> </w:t>
+      </w:r>
+      <w:r>
+        <w:t xml:space="preserve">auto-detects its parent folder as the project directory), writing skills in</w:t>
       </w:r>
       <w:r>
         <w:t xml:space="preserve"> </w:t>
@@ -1917,6 +2196,54 @@
           <w:rStyle w:val="VerbatimChar"/>
         </w:rPr>
         <w:t xml:space="preserve">claude_scientific_writer/</w:t>
+      </w:r>
+      <w:r>
+        <w:t xml:space="preserve">,</w:t>
+      </w:r>
+      <w:r>
+        <w:t xml:space="preserve"> </w:t>
+      </w:r>
+      <w:r>
+        <w:rPr>
+          <w:rStyle w:val="VerbatimChar"/>
+        </w:rPr>
+        <w:t xml:space="preserve">thesis-discussion-writer/</w:t>
+      </w:r>
+      <w:r>
+        <w:t xml:space="preserve">,</w:t>
+      </w:r>
+      <w:r>
+        <w:t xml:space="preserve"> </w:t>
+      </w:r>
+      <w:r>
+        <w:rPr>
+          <w:rStyle w:val="VerbatimChar"/>
+        </w:rPr>
+        <w:t xml:space="preserve">language-refinement/</w:t>
+      </w:r>
+      <w:r>
+        <w:t xml:space="preserve">,</w:t>
+      </w:r>
+      <w:r>
+        <w:t xml:space="preserve"> </w:t>
+      </w:r>
+      <w:r>
+        <w:rPr>
+          <w:rStyle w:val="VerbatimChar"/>
+        </w:rPr>
+        <w:t xml:space="preserve">academic-writing/</w:t>
+      </w:r>
+      <w:r>
+        <w:t xml:space="preserve">,</w:t>
+      </w:r>
+      <w:r>
+        <w:t xml:space="preserve"> </w:t>
+      </w:r>
+      <w:r>
+        <w:rPr>
+          <w:rStyle w:val="VerbatimChar"/>
+        </w:rPr>
+        <w:t xml:space="preserve">Thesis_guide.md</w:t>
       </w:r>
       <w:r>
         <w:t xml:space="preserve">),</w:t>
@@ -1976,6 +2303,15 @@
       </w:pPr>
       <w:r>
         <w:rPr>
+          <w:rStyle w:val="CommentTok"/>
+        </w:rPr>
+        <w:t xml:space="preserve"># Source-grounded mode: project Markdown files become the authoritative source</w:t>
+      </w:r>
+      <w:r>
+        <w:br/>
+      </w:r>
+      <w:r>
+        <w:rPr>
           <w:rStyle w:val="ExtensionTok"/>
         </w:rPr>
         <w:t xml:space="preserve">python</w:t>
@@ -2026,6 +2362,117 @@
         <w:rPr>
           <w:rStyle w:val="AttributeTok"/>
         </w:rPr>
+        <w:t xml:space="preserve">--project-dir</w:t>
+      </w:r>
+      <w:r>
+        <w:rPr>
+          <w:rStyle w:val="NormalTok"/>
+        </w:rPr>
+        <w:t xml:space="preserve"> </w:t>
+      </w:r>
+      <w:r>
+        <w:rPr>
+          <w:rStyle w:val="StringTok"/>
+        </w:rPr>
+        <w:t xml:space="preserve">"[INSERT_PROJECT_DIRECTORY_PATH]"</w:t>
+      </w:r>
+      <w:r>
+        <w:rPr>
+          <w:rStyle w:val="NormalTok"/>
+        </w:rPr>
+        <w:t xml:space="preserve"> </w:t>
+      </w:r>
+      <w:r>
+        <w:rPr>
+          <w:rStyle w:val="AttributeTok"/>
+        </w:rPr>
+        <w:t xml:space="preserve">--humanize</w:t>
+      </w:r>
+      <w:r>
+        <w:rPr>
+          <w:rStyle w:val="NormalTok"/>
+        </w:rPr>
+        <w:t xml:space="preserve"> </w:t>
+      </w:r>
+      <w:r>
+        <w:rPr>
+          <w:rStyle w:val="AttributeTok"/>
+        </w:rPr>
+        <w:t xml:space="preserve">--output-dir</w:t>
+      </w:r>
+      <w:r>
+        <w:rPr>
+          <w:rStyle w:val="NormalTok"/>
+        </w:rPr>
+        <w:t xml:space="preserve"> outputs</w:t>
+      </w:r>
+      <w:r>
+        <w:br/>
+      </w:r>
+      <w:r>
+        <w:br/>
+      </w:r>
+      <w:r>
+        <w:rPr>
+          <w:rStyle w:val="CommentTok"/>
+        </w:rPr>
+        <w:t xml:space="preserve"># PDF mode: the PDF's parent folder is auto-detected as the project directory</w:t>
+      </w:r>
+      <w:r>
+        <w:br/>
+      </w:r>
+      <w:r>
+        <w:rPr>
+          <w:rStyle w:val="ExtensionTok"/>
+        </w:rPr>
+        <w:t xml:space="preserve">python</w:t>
+      </w:r>
+      <w:r>
+        <w:rPr>
+          <w:rStyle w:val="NormalTok"/>
+        </w:rPr>
+        <w:t xml:space="preserve"> main.py </w:t>
+      </w:r>
+      <w:r>
+        <w:rPr>
+          <w:rStyle w:val="AttributeTok"/>
+        </w:rPr>
+        <w:t xml:space="preserve">--topic</w:t>
+      </w:r>
+      <w:r>
+        <w:rPr>
+          <w:rStyle w:val="NormalTok"/>
+        </w:rPr>
+        <w:t xml:space="preserve"> </w:t>
+      </w:r>
+      <w:r>
+        <w:rPr>
+          <w:rStyle w:val="StringTok"/>
+        </w:rPr>
+        <w:t xml:space="preserve">"[INSERT_TOPIC]"</w:t>
+      </w:r>
+      <w:r>
+        <w:rPr>
+          <w:rStyle w:val="NormalTok"/>
+        </w:rPr>
+        <w:t xml:space="preserve"> </w:t>
+      </w:r>
+      <w:r>
+        <w:rPr>
+          <w:rStyle w:val="AttributeTok"/>
+        </w:rPr>
+        <w:t xml:space="preserve">--type</w:t>
+      </w:r>
+      <w:r>
+        <w:rPr>
+          <w:rStyle w:val="NormalTok"/>
+        </w:rPr>
+        <w:t xml:space="preserve"> thesis </w:t>
+      </w:r>
+      <w:r>
+        <w:rPr>
+          <w:rStyle w:val="AttributeTok"/>
+        </w:rPr>
         <w:t xml:space="preserve">--pdf-input</w:t>
       </w:r>
       <w:r>
@@ -2073,6 +2520,98 @@
     </w:p>
     <w:p>
       <w:pPr>
+        <w:pStyle w:val="BlockText"/>
+      </w:pPr>
+      <w:r>
+        <w:t xml:space="preserve">With</w:t>
+      </w:r>
+      <w:r>
+        <w:t xml:space="preserve"> </w:t>
+      </w:r>
+      <w:r>
+        <w:rPr>
+          <w:rStyle w:val="VerbatimChar"/>
+        </w:rPr>
+        <w:t xml:space="preserve">--type thesis</w:t>
+      </w:r>
+      <w:r>
+        <w:t xml:space="preserve"> </w:t>
+      </w:r>
+      <w:r>
+        <w:t xml:space="preserve">plus a project directory, the pipeline focuses generation on the Discussion and References sections and enforces the required ending headers (</w:t>
+      </w:r>
+      <w:r>
+        <w:rPr>
+          <w:rStyle w:val="VerbatimChar"/>
+        </w:rPr>
+        <w:t xml:space="preserve">## Summary</w:t>
+      </w:r>
+      <w:r>
+        <w:t xml:space="preserve">,</w:t>
+      </w:r>
+      <w:r>
+        <w:t xml:space="preserve"> </w:t>
+      </w:r>
+      <w:r>
+        <w:rPr>
+          <w:rStyle w:val="VerbatimChar"/>
+        </w:rPr>
+        <w:t xml:space="preserve">## Summary of results</w:t>
+      </w:r>
+      <w:r>
+        <w:t xml:space="preserve">,</w:t>
+      </w:r>
+      <w:r>
+        <w:t xml:space="preserve"> </w:t>
+      </w:r>
+      <w:r>
+        <w:rPr>
+          <w:rStyle w:val="VerbatimChar"/>
+        </w:rPr>
+        <w:t xml:space="preserve">## Conclusions</w:t>
+      </w:r>
+      <w:r>
+        <w:t xml:space="preserve">,</w:t>
+      </w:r>
+      <w:r>
+        <w:t xml:space="preserve"> </w:t>
+      </w:r>
+      <w:r>
+        <w:rPr>
+          <w:rStyle w:val="VerbatimChar"/>
+        </w:rPr>
+        <w:t xml:space="preserve">## Limitations</w:t>
+      </w:r>
+      <w:r>
+        <w:t xml:space="preserve">,</w:t>
+      </w:r>
+      <w:r>
+        <w:t xml:space="preserve"> </w:t>
+      </w:r>
+      <w:r>
+        <w:rPr>
+          <w:rStyle w:val="VerbatimChar"/>
+        </w:rPr>
+        <w:t xml:space="preserve">## Recommendations</w:t>
+      </w:r>
+      <w:r>
+        <w:t xml:space="preserve">,</w:t>
+      </w:r>
+      <w:r>
+        <w:t xml:space="preserve"> </w:t>
+      </w:r>
+      <w:r>
+        <w:rPr>
+          <w:rStyle w:val="VerbatimChar"/>
+        </w:rPr>
+        <w:t xml:space="preserve">## References</w:t>
+      </w:r>
+      <w:r>
+        <w:t xml:space="preserve">).</w:t>
+      </w:r>
+    </w:p>
+    <w:p>
+      <w:pPr>
         <w:pStyle w:val="SourceCode"/>
       </w:pPr>
       <w:r>
@@ -2238,6 +2777,42 @@
         <w:rPr>
           <w:rStyle w:val="VerbatimChar"/>
         </w:rPr>
+        <w:t xml:space="preserve">   - `meddraft_ai/prompts/thesis-discussion-writer/` (Discussion house style: inverted-funnel architecture, block rhythm, ending headers)</w:t>
+      </w:r>
+      <w:r>
+        <w:br/>
+      </w:r>
+      <w:r>
+        <w:rPr>
+          <w:rStyle w:val="VerbatimChar"/>
+        </w:rPr>
+        <w:t xml:space="preserve">   - `meddraft_ai/prompts/language-refinement/` (zero-alteration polishing pass with scripted verification)</w:t>
+      </w:r>
+      <w:r>
+        <w:br/>
+      </w:r>
+      <w:r>
+        <w:rPr>
+          <w:rStyle w:val="VerbatimChar"/>
+        </w:rPr>
+        <w:t xml:space="preserve">   - `meddraft_ai/prompts/academic-writing/` (IMRAD/AMA formatting rules)</w:t>
+      </w:r>
+      <w:r>
+        <w:br/>
+      </w:r>
+      <w:r>
+        <w:rPr>
+          <w:rStyle w:val="VerbatimChar"/>
+        </w:rPr>
+        <w:t xml:space="preserve">   - `meddraft_ai/prompts/Thesis_guide.md` (thesis compliance rules)</w:t>
+      </w:r>
+      <w:r>
+        <w:br/>
+      </w:r>
+      <w:r>
+        <w:rPr>
+          <w:rStyle w:val="VerbatimChar"/>
+        </w:rPr>
         <w:t xml:space="preserve">3. Style Mimicry Directory: [INSERT_STYLE_SAMPLES_DIRECTORY]</w:t>
       </w:r>
       <w:r>
@@ -2314,6 +2889,33 @@
           <w:rStyle w:val="VerbatimChar"/>
         </w:rPr>
         <w:t xml:space="preserve">### PHASE 1: Data Ingestion &amp; Metric Extraction</w:t>
+      </w:r>
+      <w:r>
+        <w:br/>
+      </w:r>
+      <w:r>
+        <w:rPr>
+          <w:rStyle w:val="VerbatimChar"/>
+        </w:rPr>
+        <w:t xml:space="preserve">- PRECONDITION: If the project directory contains no readable protocol/results Markdown</w:t>
+      </w:r>
+      <w:r>
+        <w:br/>
+      </w:r>
+      <w:r>
+        <w:rPr>
+          <w:rStyle w:val="VerbatimChar"/>
+        </w:rPr>
+        <w:t xml:space="preserve">  files, STOP and report exactly which files are missing. Never substitute memory,</w:t>
+      </w:r>
+      <w:r>
+        <w:br/>
+      </w:r>
+      <w:r>
+        <w:rPr>
+          <w:rStyle w:val="VerbatimChar"/>
+        </w:rPr>
+        <w:t xml:space="preserve">  generic literature values, or plausible-sounding numbers for missing project data.</w:t>
       </w:r>
       <w:r>
         <w:br/>
@@ -2837,11 +3439,17 @@
         </w:rPr>
         <w:t xml:space="preserve">Beginner tips</w:t>
       </w:r>
-      <w:r>
-        <w:t xml:space="preserve"> </w:t>
-      </w:r>
-      <w:r>
-        <w:t xml:space="preserve">- Use the bundled pipeline for the heavy lifting, then use this prompt only for the Discussion:</w:t>
+    </w:p>
+    <w:p>
+      <w:pPr>
+        <w:pStyle w:val="Compact"/>
+        <w:numPr>
+          <w:ilvl w:val="0"/>
+          <w:numId w:val="1003"/>
+        </w:numPr>
+      </w:pPr>
+      <w:r>
+        <w:t xml:space="preserve">Use the bundled pipeline for the heavy lifting, then use this prompt only for the Discussion:</w:t>
       </w:r>
       <w:r>
         <w:t xml:space="preserve"> </w:t>
@@ -2852,11 +3460,17 @@
         </w:rPr>
         <w:t xml:space="preserve">python main.py --topic "..." --type thesis --sections "Discussion" --pdf-input "..."</w:t>
       </w:r>
-      <w:r>
-        <w:t xml:space="preserve"> </w:t>
-      </w:r>
-      <w:r>
-        <w:t xml:space="preserve">- The</w:t>
+    </w:p>
+    <w:p>
+      <w:pPr>
+        <w:pStyle w:val="Compact"/>
+        <w:numPr>
+          <w:ilvl w:val="0"/>
+          <w:numId w:val="1003"/>
+        </w:numPr>
+      </w:pPr>
+      <w:r>
+        <w:t xml:space="preserve">The</w:t>
       </w:r>
       <w:r>
         <w:t xml:space="preserve"> </w:t>
@@ -2882,7 +3496,7 @@
       </w:r>
     </w:p>
     <w:bookmarkEnd w:id="13"/>
-    <w:bookmarkStart w:id="14" w:name="X31e09653f665a3f2028aa40b6b46e59a9dd8a53"/>
+    <w:bookmarkStart w:id="14" w:name="X0cff69f62e158bb022319ff74a93c1cf8b65f55"/>
     <w:p>
       <w:pPr>
         <w:pStyle w:val="Heading1"/>
@@ -2906,7 +3520,7 @@
         <w:t xml:space="preserve"> </w:t>
       </w:r>
       <w:r>
-        <w:t xml:space="preserve">Convert study PDFs into high-fidelity Markdown (tables, images, OCR) using the repo’s built-in Docling converter — no need to write your own script.</w:t>
+        <w:t xml:space="preserve">Convert study PDFs into high-fidelity Markdown (tables, images, OCR) using the repo's built-in Docling converter. If the one-liner below already produced your Markdown, you are done — this prompt is for having an agent build a reusable, parameterized driver script for batches of PDFs.</w:t>
       </w:r>
     </w:p>
     <w:p>
@@ -3054,6 +3668,102 @@
         <w:rPr>
           <w:rStyle w:val="VerbatimChar"/>
         </w:rPr>
+        <w:t xml:space="preserve">&lt;ROLE&gt;</w:t>
+      </w:r>
+      <w:r>
+        <w:br/>
+      </w:r>
+      <w:r>
+        <w:rPr>
+          <w:rStyle w:val="VerbatimChar"/>
+        </w:rPr>
+        <w:t xml:space="preserve">You are an expert Python developer specialized in document processing and RAG pipeline</w:t>
+      </w:r>
+      <w:r>
+        <w:br/>
+      </w:r>
+      <w:r>
+        <w:rPr>
+          <w:rStyle w:val="VerbatimChar"/>
+        </w:rPr>
+        <w:t xml:space="preserve">engineering, working inside the MedDraft_AI repo. Reuse the repo's converter — do not</w:t>
+      </w:r>
+      <w:r>
+        <w:br/>
+      </w:r>
+      <w:r>
+        <w:rPr>
+          <w:rStyle w:val="VerbatimChar"/>
+        </w:rPr>
+        <w:t xml:space="preserve">write a fresh extraction implementation.</w:t>
+      </w:r>
+      <w:r>
+        <w:br/>
+      </w:r>
+      <w:r>
+        <w:rPr>
+          <w:rStyle w:val="VerbatimChar"/>
+        </w:rPr>
+        <w:t xml:space="preserve">&lt;/ROLE&gt;</w:t>
+      </w:r>
+      <w:r>
+        <w:br/>
+      </w:r>
+      <w:r>
+        <w:br/>
+      </w:r>
+      <w:r>
+        <w:rPr>
+          <w:rStyle w:val="VerbatimChar"/>
+        </w:rPr>
+        <w:t xml:space="preserve">&lt;INPUTS&gt;</w:t>
+      </w:r>
+      <w:r>
+        <w:br/>
+      </w:r>
+      <w:r>
+        <w:rPr>
+          <w:rStyle w:val="VerbatimChar"/>
+        </w:rPr>
+        <w:t xml:space="preserve">TARGET_DIRECTORY: [INSERT_TARGET_DIRECTORY_PATH]</w:t>
+      </w:r>
+      <w:r>
+        <w:br/>
+      </w:r>
+      <w:r>
+        <w:rPr>
+          <w:rStyle w:val="VerbatimChar"/>
+        </w:rPr>
+        <w:t xml:space="preserve">PDF_FILE_NAME: [INSERT_FILE_NAME]        # omit to process every PDF in TARGET_DIRECTORY</w:t>
+      </w:r>
+      <w:r>
+        <w:br/>
+      </w:r>
+      <w:r>
+        <w:rPr>
+          <w:rStyle w:val="VerbatimChar"/>
+        </w:rPr>
+        <w:t xml:space="preserve">OUTPUT_DIR: outputs/pdf_extractions       # converter default</w:t>
+      </w:r>
+      <w:r>
+        <w:br/>
+      </w:r>
+      <w:r>
+        <w:rPr>
+          <w:rStyle w:val="VerbatimChar"/>
+        </w:rPr>
+        <w:t xml:space="preserve">&lt;/INPUTS&gt;</w:t>
+      </w:r>
+      <w:r>
+        <w:br/>
+      </w:r>
+      <w:r>
+        <w:br/>
+      </w:r>
+      <w:r>
+        <w:rPr>
+          <w:rStyle w:val="VerbatimChar"/>
+        </w:rPr>
         <w:t xml:space="preserve">Using the built-in converter in `meddraft_ai/extraction/converter.py`</w:t>
       </w:r>
       <w:r>
@@ -3072,37 +3782,16 @@
         <w:rPr>
           <w:rStyle w:val="VerbatimChar"/>
         </w:rPr>
-        <w:t xml:space="preserve">(ExtractionEngine), parse the files located at [INSERT_TARGET_DIRECTORY_PATH] and</w:t>
-      </w:r>
-      <w:r>
-        <w:br/>
-      </w:r>
-      <w:r>
-        <w:rPr>
-          <w:rStyle w:val="VerbatimChar"/>
-        </w:rPr>
-        <w:t xml:space="preserve">transform them into Markdown files saved to `outputs/pdf_extractions/`.</w:t>
-      </w:r>
-      <w:r>
-        <w:br/>
-      </w:r>
-      <w:r>
-        <w:br/>
-      </w:r>
-      <w:r>
-        <w:rPr>
-          <w:rStyle w:val="VerbatimChar"/>
-        </w:rPr>
-        <w:t xml:space="preserve">Act as an expert Python developer specialized in document processing and RAG pipeline</w:t>
-      </w:r>
-      <w:r>
-        <w:br/>
-      </w:r>
-      <w:r>
-        <w:rPr>
-          <w:rStyle w:val="VerbatimChar"/>
-        </w:rPr>
-        <w:t xml:space="preserve">engineering, but reuse the repo's module instead of writing a fresh script.</w:t>
+        <w:t xml:space="preserve">(ExtractionEngine), parse the PDFs located at TARGET_DIRECTORY and transform them into</w:t>
+      </w:r>
+      <w:r>
+        <w:br/>
+      </w:r>
+      <w:r>
+        <w:rPr>
+          <w:rStyle w:val="VerbatimChar"/>
+        </w:rPr>
+        <w:t xml:space="preserve">Markdown files saved to OUTPUT_DIR.</w:t>
       </w:r>
       <w:r>
         <w:br/>
@@ -3123,16 +3812,16 @@
         <w:rPr>
           <w:rStyle w:val="VerbatimChar"/>
         </w:rPr>
-        <w:t xml:space="preserve">1. DOCUMENT LOADING: Instantiate ExtractionEngine with each PDF path in</w:t>
-      </w:r>
-      <w:r>
-        <w:br/>
-      </w:r>
-      <w:r>
-        <w:rPr>
-          <w:rStyle w:val="VerbatimChar"/>
-        </w:rPr>
-        <w:t xml:space="preserve">   [INSERT_TARGET_DIRECTORY_PATH].</w:t>
+        <w:t xml:space="preserve">1. DOCUMENT LOADING: Instantiate ExtractionEngine(pdf_path, output_dir) with each PDF</w:t>
+      </w:r>
+      <w:r>
+        <w:br/>
+      </w:r>
+      <w:r>
+        <w:rPr>
+          <w:rStyle w:val="VerbatimChar"/>
+        </w:rPr>
+        <w:t xml:space="preserve">   path in TARGET_DIRECTORY.</w:t>
       </w:r>
       <w:r>
         <w:br/>
@@ -3246,6 +3935,33 @@
         <w:br/>
       </w:r>
       <w:r>
+        <w:rPr>
+          <w:rStyle w:val="VerbatimChar"/>
+        </w:rPr>
+        <w:t xml:space="preserve">6. CAPABILITY GUARD: If you cannot read the PDFs or run code, STOP and ask for them to</w:t>
+      </w:r>
+      <w:r>
+        <w:br/>
+      </w:r>
+      <w:r>
+        <w:rPr>
+          <w:rStyle w:val="VerbatimChar"/>
+        </w:rPr>
+        <w:t xml:space="preserve">   be extracted with the CLI one-liner above — never fabricate extraction results or</w:t>
+      </w:r>
+      <w:r>
+        <w:br/>
+      </w:r>
+      <w:r>
+        <w:rPr>
+          <w:rStyle w:val="VerbatimChar"/>
+        </w:rPr>
+        <w:t xml:space="preserve">   Markdown content from memory.</w:t>
+      </w:r>
+      <w:r>
+        <w:br/>
+      </w:r>
+      <w:r>
         <w:br/>
       </w:r>
       <w:r>
@@ -3261,7 +3977,7 @@
         <w:rPr>
           <w:rStyle w:val="VerbatimChar"/>
         </w:rPr>
-        <w:t xml:space="preserve">- Write a small driver script that imports `meddraft_ai.extraction.extraction_engine`.</w:t>
+        <w:t xml:space="preserve">- Write a small reusable driver script that imports `meddraft_ai.extraction.extraction_engine`.</w:t>
       </w:r>
       <w:r>
         <w:br/>
@@ -3298,6 +4014,36 @@
           <w:rStyle w:val="VerbatimChar"/>
         </w:rPr>
         <w:t xml:space="preserve">- Print the returned `markdown_path` and `verified_citations` for each PDF.</w:t>
+      </w:r>
+      <w:r>
+        <w:br/>
+      </w:r>
+      <w:r>
+        <w:br/>
+      </w:r>
+      <w:r>
+        <w:rPr>
+          <w:rStyle w:val="VerbatimChar"/>
+        </w:rPr>
+        <w:t xml:space="preserve">### Final Report</w:t>
+      </w:r>
+      <w:r>
+        <w:br/>
+      </w:r>
+      <w:r>
+        <w:rPr>
+          <w:rStyle w:val="VerbatimChar"/>
+        </w:rPr>
+        <w:t xml:space="preserve">End with a one-line run report per PDF:</w:t>
+      </w:r>
+      <w:r>
+        <w:br/>
+      </w:r>
+      <w:r>
+        <w:rPr>
+          <w:rStyle w:val="VerbatimChar"/>
+        </w:rPr>
+        <w:t xml:space="preserve">`&lt;pdf_name&gt; → &lt;markdown_path&gt; | figures: N | verified citations: N`</w:t>
       </w:r>
     </w:p>
     <w:p>
@@ -3311,11 +4057,17 @@
         </w:rPr>
         <w:t xml:space="preserve">Beginner tips</w:t>
       </w:r>
-      <w:r>
-        <w:t xml:space="preserve"> </w:t>
-      </w:r>
-      <w:r>
-        <w:t xml:space="preserve">- Docling falls back to plain</w:t>
+    </w:p>
+    <w:p>
+      <w:pPr>
+        <w:pStyle w:val="Compact"/>
+        <w:numPr>
+          <w:ilvl w:val="0"/>
+          <w:numId w:val="1004"/>
+        </w:numPr>
+      </w:pPr>
+      <w:r>
+        <w:t xml:space="preserve">Docling falls back to plain</w:t>
       </w:r>
       <w:r>
         <w:t xml:space="preserve"> </w:t>
@@ -3332,11 +4084,17 @@
       <w:r>
         <w:t xml:space="preserve">text extraction automatically if Docling/OCR is not installed — tables and images will be lost in that case, so install requirements first.</w:t>
       </w:r>
-      <w:r>
-        <w:t xml:space="preserve"> </w:t>
-      </w:r>
-      <w:r>
-        <w:t xml:space="preserve">- Each PDF gets its own folder:</w:t>
+    </w:p>
+    <w:p>
+      <w:pPr>
+        <w:pStyle w:val="Compact"/>
+        <w:numPr>
+          <w:ilvl w:val="0"/>
+          <w:numId w:val="1004"/>
+        </w:numPr>
+      </w:pPr>
+      <w:r>
+        <w:t xml:space="preserve">Each PDF gets its own folder:</w:t>
       </w:r>
       <w:r>
         <w:t xml:space="preserve"> </w:t>
@@ -3374,7 +4132,7 @@
       </w:r>
     </w:p>
     <w:bookmarkEnd w:id="14"/>
-    <w:bookmarkStart w:id="15" w:name="Xea17264e96db48e7cea24dde5195c554657ddc3"/>
+    <w:bookmarkStart w:id="15" w:name="X5bedd60281f7dc7a0d6ff72f5027ccaecb406ea"/>
     <w:p>
       <w:pPr>
         <w:pStyle w:val="Heading1"/>
@@ -3398,7 +4156,7 @@
         <w:t xml:space="preserve"> </w:t>
       </w:r>
       <w:r>
-        <w:t xml:space="preserve">Reconstruct raw numeric data from a published study’s PDF tables so you can reuse the statistics (or compare against your own). This repo has no IPD-from-KM/Sprite tooling, so this prompt maps to its real equivalents:</w:t>
+        <w:t xml:space="preserve">Reconstruct raw numeric data from a published study's PDF tables so you can reuse the statistics (or compare against your own). This repo has no IPD-from-KM/Sprite tooling, so this prompt maps to its real equivalents:</w:t>
       </w:r>
       <w:r>
         <w:t xml:space="preserve"> </w:t>
@@ -3532,16 +4290,82 @@
         <w:rPr>
           <w:rStyle w:val="VerbatimChar"/>
         </w:rPr>
-        <w:t xml:space="preserve">"I have a published medical study located at [INSERT_PUBLISHED_STUDY_DIRECTORY].</w:t>
-      </w:r>
-      <w:r>
-        <w:br/>
-      </w:r>
-      <w:r>
-        <w:rPr>
-          <w:rStyle w:val="VerbatimChar"/>
-        </w:rPr>
-        <w:t xml:space="preserve">Please reverse-engineer the results section using MedDraft_AI's real capabilities.</w:t>
+        <w:t xml:space="preserve">&lt;ROLE&gt;</w:t>
+      </w:r>
+      <w:r>
+        <w:br/>
+      </w:r>
+      <w:r>
+        <w:rPr>
+          <w:rStyle w:val="VerbatimChar"/>
+        </w:rPr>
+        <w:t xml:space="preserve">You are a research-data reconstruction specialist operating inside the MedDraft_AI</w:t>
+      </w:r>
+      <w:r>
+        <w:br/>
+      </w:r>
+      <w:r>
+        <w:rPr>
+          <w:rStyle w:val="VerbatimChar"/>
+        </w:rPr>
+        <w:t xml:space="preserve">platform. Reconstruct exactly the statistics printed in a published study's tables —</w:t>
+      </w:r>
+      <w:r>
+        <w:br/>
+      </w:r>
+      <w:r>
+        <w:rPr>
+          <w:rStyle w:val="VerbatimChar"/>
+        </w:rPr>
+        <w:t xml:space="preserve">nothing more, nothing less.</w:t>
+      </w:r>
+      <w:r>
+        <w:br/>
+      </w:r>
+      <w:r>
+        <w:rPr>
+          <w:rStyle w:val="VerbatimChar"/>
+        </w:rPr>
+        <w:t xml:space="preserve">&lt;/ROLE&gt;</w:t>
+      </w:r>
+      <w:r>
+        <w:br/>
+      </w:r>
+      <w:r>
+        <w:br/>
+      </w:r>
+      <w:r>
+        <w:rPr>
+          <w:rStyle w:val="VerbatimChar"/>
+        </w:rPr>
+        <w:t xml:space="preserve">&lt;INPUTS&gt;</w:t>
+      </w:r>
+      <w:r>
+        <w:br/>
+      </w:r>
+      <w:r>
+        <w:rPr>
+          <w:rStyle w:val="VerbatimChar"/>
+        </w:rPr>
+        <w:t xml:space="preserve">PUBLISHED_STUDY_PDF: [INSERT_PUBLISHED_STUDY_DIRECTORY]/[study].pdf</w:t>
+      </w:r>
+      <w:r>
+        <w:br/>
+      </w:r>
+      <w:r>
+        <w:rPr>
+          <w:rStyle w:val="VerbatimChar"/>
+        </w:rPr>
+        <w:t xml:space="preserve">OUTPUT_DATASET_PATH: [INSERT_OUTPUT_DATASET_PATH]</w:t>
+      </w:r>
+      <w:r>
+        <w:br/>
+      </w:r>
+      <w:r>
+        <w:rPr>
+          <w:rStyle w:val="VerbatimChar"/>
+        </w:rPr>
+        <w:t xml:space="preserve">&lt;/INPUTS&gt;</w:t>
       </w:r>
       <w:r>
         <w:br/>
@@ -3625,7 +4449,25 @@
         <w:rPr>
           <w:rStyle w:val="VerbatimChar"/>
         </w:rPr>
-        <w:t xml:space="preserve">   Do NOT invent values that are not printed in the tables — mark missing cells as null.</w:t>
+        <w:t xml:space="preserve">   Distinguish three value classes in the output: PRINTED (copied verbatim from a table</w:t>
+      </w:r>
+      <w:r>
+        <w:br/>
+      </w:r>
+      <w:r>
+        <w:rPr>
+          <w:rStyle w:val="VerbatimChar"/>
+        </w:rPr>
+        <w:t xml:space="preserve">   cell), DERIVED (computed by explicit arithmetic from printed values — show the</w:t>
+      </w:r>
+      <w:r>
+        <w:br/>
+      </w:r>
+      <w:r>
+        <w:rPr>
+          <w:rStyle w:val="VerbatimChar"/>
+        </w:rPr>
+        <w:t xml:space="preserve">   arithmetic), and null (cell not printed).</w:t>
       </w:r>
       <w:r>
         <w:br/>
@@ -3652,16 +4494,16 @@
         <w:rPr>
           <w:rStyle w:val="VerbatimChar"/>
         </w:rPr>
-        <w:t xml:space="preserve">   and table, or save it to disk for `python main.py --topic \"...\" --data-file</w:t>
-      </w:r>
-      <w:r>
-        <w:br/>
-      </w:r>
-      <w:r>
-        <w:rPr>
-          <w:rStyle w:val="VerbatimChar"/>
-        </w:rPr>
-        <w:t xml:space="preserve">   [INSERT_OUTPUT_JSON_PATH]`.</w:t>
+        <w:t xml:space="preserve">   and table, or save it to disk for `python main.py --topic "..." --data-file</w:t>
+      </w:r>
+      <w:r>
+        <w:br/>
+      </w:r>
+      <w:r>
+        <w:rPr>
+          <w:rStyle w:val="VerbatimChar"/>
+        </w:rPr>
+        <w:t xml:space="preserve">   OUTPUT_DATASET_PATH`.</w:t>
       </w:r>
       <w:r>
         <w:br/>
@@ -3679,7 +4521,139 @@
         <w:rPr>
           <w:rStyle w:val="VerbatimChar"/>
         </w:rPr>
-        <w:t xml:space="preserve">   [INSERT_OUTPUT_DATASET_PATH] with a companion APA-style table."</w:t>
+        <w:t xml:space="preserve">   OUTPUT_DATASET_PATH with a companion APA-style table.</w:t>
+      </w:r>
+      <w:r>
+        <w:br/>
+      </w:r>
+      <w:r>
+        <w:br/>
+      </w:r>
+      <w:r>
+        <w:rPr>
+          <w:rStyle w:val="VerbatimChar"/>
+        </w:rPr>
+        <w:t xml:space="preserve">&lt;NO_SIMULATION_GUARD&gt;</w:t>
+      </w:r>
+      <w:r>
+        <w:br/>
+      </w:r>
+      <w:r>
+        <w:rPr>
+          <w:rStyle w:val="VerbatimChar"/>
+        </w:rPr>
+        <w:t xml:space="preserve">- Do NOT invent values that are not printed in the tables — a blank cell maps to null,</w:t>
+      </w:r>
+      <w:r>
+        <w:br/>
+      </w:r>
+      <w:r>
+        <w:rPr>
+          <w:rStyle w:val="VerbatimChar"/>
+        </w:rPr>
+        <w:t xml:space="preserve">  never to a guess, interpolation, or a "typical" value from memory.</w:t>
+      </w:r>
+      <w:r>
+        <w:br/>
+      </w:r>
+      <w:r>
+        <w:rPr>
+          <w:rStyle w:val="VerbatimChar"/>
+        </w:rPr>
+        <w:t xml:space="preserve">- If you cannot read the PDF, STOP and ask for the page-marked text or the extracted</w:t>
+      </w:r>
+      <w:r>
+        <w:br/>
+      </w:r>
+      <w:r>
+        <w:rPr>
+          <w:rStyle w:val="VerbatimChar"/>
+        </w:rPr>
+        <w:t xml:space="preserve">  tables. Never reconstruct statistics from memory of the paper or from similar studies.</w:t>
+      </w:r>
+      <w:r>
+        <w:br/>
+      </w:r>
+      <w:r>
+        <w:rPr>
+          <w:rStyle w:val="VerbatimChar"/>
+        </w:rPr>
+        <w:t xml:space="preserve">- MedicalWriterAgent copies JSON values verbatim into the narrative — whatever you put</w:t>
+      </w:r>
+      <w:r>
+        <w:br/>
+      </w:r>
+      <w:r>
+        <w:rPr>
+          <w:rStyle w:val="VerbatimChar"/>
+        </w:rPr>
+        <w:t xml:space="preserve">  in the JSON is what the manuscript will claim.</w:t>
+      </w:r>
+      <w:r>
+        <w:br/>
+      </w:r>
+      <w:r>
+        <w:rPr>
+          <w:rStyle w:val="VerbatimChar"/>
+        </w:rPr>
+        <w:t xml:space="preserve">&lt;/NO_SIMULATION_GUARD&gt;</w:t>
+      </w:r>
+      <w:r>
+        <w:br/>
+      </w:r>
+      <w:r>
+        <w:br/>
+      </w:r>
+      <w:r>
+        <w:rPr>
+          <w:rStyle w:val="VerbatimChar"/>
+        </w:rPr>
+        <w:t xml:space="preserve">&lt;OUTPUT_FORMAT&gt;</w:t>
+      </w:r>
+      <w:r>
+        <w:br/>
+      </w:r>
+      <w:r>
+        <w:rPr>
+          <w:rStyle w:val="VerbatimChar"/>
+        </w:rPr>
+        <w:t xml:space="preserve">1. The statistics JSON at OUTPUT_DATASET_PATH (freeform structure: group names, n,</w:t>
+      </w:r>
+      <w:r>
+        <w:br/>
+      </w:r>
+      <w:r>
+        <w:rPr>
+          <w:rStyle w:val="VerbatimChar"/>
+        </w:rPr>
+        <w:t xml:space="preserve">   means, SDs, tests, exact p-values; every value tagged PRINTED / DERIVED / null).</w:t>
+      </w:r>
+      <w:r>
+        <w:br/>
+      </w:r>
+      <w:r>
+        <w:rPr>
+          <w:rStyle w:val="VerbatimChar"/>
+        </w:rPr>
+        <w:t xml:space="preserve">2. A companion APA-style table of the same values.</w:t>
+      </w:r>
+      <w:r>
+        <w:br/>
+      </w:r>
+      <w:r>
+        <w:rPr>
+          <w:rStyle w:val="VerbatimChar"/>
+        </w:rPr>
+        <w:t xml:space="preserve">3. A reconstruction log: each JSON value → its source (PDF page/table) or null.</w:t>
+      </w:r>
+      <w:r>
+        <w:br/>
+      </w:r>
+      <w:r>
+        <w:rPr>
+          <w:rStyle w:val="VerbatimChar"/>
+        </w:rPr>
+        <w:t xml:space="preserve">&lt;/OUTPUT_FORMAT&gt;</w:t>
       </w:r>
     </w:p>
     <w:p>
@@ -3693,11 +4667,17 @@
         </w:rPr>
         <w:t xml:space="preserve">Beginner tips</w:t>
       </w:r>
-      <w:r>
-        <w:t xml:space="preserve"> </w:t>
-      </w:r>
-      <w:r>
-        <w:t xml:space="preserve">- Only numbers actually printed in the PDF can be extracted. If a table cell is blank, the JSON must contain</w:t>
+    </w:p>
+    <w:p>
+      <w:pPr>
+        <w:pStyle w:val="Compact"/>
+        <w:numPr>
+          <w:ilvl w:val="0"/>
+          <w:numId w:val="1005"/>
+        </w:numPr>
+      </w:pPr>
+      <w:r>
+        <w:t xml:space="preserve">Only numbers actually printed in the PDF can be extracted. If a table cell is blank, the JSON must contain</w:t>
       </w:r>
       <w:r>
         <w:t xml:space="preserve"> </w:t>
@@ -3711,11 +4691,17 @@
       <w:r>
         <w:t xml:space="preserve">, never a guess.</w:t>
       </w:r>
-      <w:r>
-        <w:t xml:space="preserve"> </w:t>
-      </w:r>
-      <w:r>
-        <w:t xml:space="preserve">- After the JSON is ready, this one-liner produces an APA Results narrative:</w:t>
+    </w:p>
+    <w:p>
+      <w:pPr>
+        <w:pStyle w:val="Compact"/>
+        <w:numPr>
+          <w:ilvl w:val="0"/>
+          <w:numId w:val="1005"/>
+        </w:numPr>
+      </w:pPr>
+      <w:r>
+        <w:t xml:space="preserve">After the JSON is ready, this one-liner produces an APA Results narrative:</w:t>
       </w:r>
       <w:r>
         <w:t xml:space="preserve"> </w:t>
@@ -3735,7 +4721,7 @@
       </w:r>
     </w:p>
     <w:bookmarkEnd w:id="15"/>
-    <w:bookmarkStart w:id="21" w:name="X8aa2a94967f752a851e1bbe6d5e2754e279e04e"/>
+    <w:bookmarkStart w:id="21" w:name="X7e6509e5a4513699638a08173a13dcb93f6727f"/>
     <w:p>
       <w:pPr>
         <w:pStyle w:val="Heading1"/>
@@ -3744,7 +4730,7 @@
         <w:t xml:space="preserve">🧭 PROMPT 5 — The Five Master Prompts (tailored to repo modules)</w:t>
       </w:r>
     </w:p>
-    <w:bookmarkStart w:id="16" w:name="X9469d431d77547eae7bb498daeb0b20da554bc4"/>
+    <w:bookmarkStart w:id="16" w:name="X03817d76ca84596cdd643928e9574ad7cae54d4"/>
     <w:p>
       <w:pPr>
         <w:pStyle w:val="Heading2"/>
@@ -3797,7 +4783,7 @@
         <w:rPr>
           <w:rStyle w:val="VerbatimChar"/>
         </w:rPr>
-        <w:t xml:space="preserve">Act as an expert clinical trialist and methodologist. Produce a complete, submission-ready</w:t>
+        <w:t xml:space="preserve">You are an expert clinical trialist and methodologist. Produce a complete, submission-ready</w:t>
       </w:r>
       <w:r>
         <w:br/>
@@ -3972,7 +4958,7 @@
       </w:r>
     </w:p>
     <w:bookmarkEnd w:id="16"/>
-    <w:bookmarkStart w:id="17" w:name="Xc698846604421af54639ab32fb6f6c8b16c7fe1"/>
+    <w:bookmarkStart w:id="17" w:name="Xe0f33cfeea6878cb1993e825fac080178e7bb3c"/>
     <w:p>
       <w:pPr>
         <w:pStyle w:val="Heading2"/>
@@ -4097,7 +5083,7 @@
         <w:rPr>
           <w:rStyle w:val="VerbatimChar"/>
         </w:rPr>
-        <w:t xml:space="preserve">Act as a systematic review methodologist. Run the full screening pipeline using</w:t>
+        <w:t xml:space="preserve">You are a systematic review methodologist. Run the full screening pipeline using</w:t>
       </w:r>
       <w:r>
         <w:br/>
@@ -4310,7 +5296,7 @@
       </w:r>
     </w:p>
     <w:bookmarkEnd w:id="17"/>
-    <w:bookmarkStart w:id="18" w:name="X68368566fa09600c0106bbfb9675416b24bd918"/>
+    <w:bookmarkStart w:id="18" w:name="X5432e55246bc5ebad692943681bc828d5d988eb"/>
     <w:p>
       <w:pPr>
         <w:pStyle w:val="Heading2"/>
@@ -4390,7 +5376,7 @@
         <w:rPr>
           <w:rStyle w:val="VerbatimChar"/>
         </w:rPr>
-        <w:t xml:space="preserve">Act as a senior biostatistician. Analyze the dataset and produce APA 7th compliant</w:t>
+        <w:t xml:space="preserve">You are a senior biostatistician. Analyze the dataset and produce APA 7th compliant</w:t>
       </w:r>
       <w:r>
         <w:br/>
@@ -4573,7 +5559,7 @@
       </w:r>
     </w:p>
     <w:bookmarkEnd w:id="18"/>
-    <w:bookmarkStart w:id="19" w:name="X4d79cd95b1bfa0b632e9372ae33fc12538fe7d8"/>
+    <w:bookmarkStart w:id="19" w:name="X44a0615e35a431688ae331bf41a16d64c15d534"/>
     <w:p>
       <w:pPr>
         <w:pStyle w:val="Heading2"/>
@@ -4632,7 +5618,7 @@
         <w:rPr>
           <w:rStyle w:val="VerbatimChar"/>
         </w:rPr>
-        <w:t xml:space="preserve">Act as a medical educator and slide architect. Read the source material (a MedDraft_AI</w:t>
+        <w:t xml:space="preserve">You are a medical educator and slide architect. Read the source material (a MedDraft_AI</w:t>
       </w:r>
       <w:r>
         <w:br/>
@@ -4759,7 +5745,7 @@
       </w:r>
     </w:p>
     <w:bookmarkEnd w:id="19"/>
-    <w:bookmarkStart w:id="20" w:name="X64902ed1bd44f917ba45298d03556dcb49a29cc"/>
+    <w:bookmarkStart w:id="20" w:name="Xf4bc4556dd3052c1312a202587386eb660ab8e4"/>
     <w:p>
       <w:pPr>
         <w:pStyle w:val="Heading2"/>
@@ -4970,7 +5956,7 @@
         <w:rPr>
           <w:rStyle w:val="VerbatimChar"/>
         </w:rPr>
-        <w:t xml:space="preserve">Act as a manuscript-submission specialist. Calibrate the draft prose to the target</w:t>
+        <w:t xml:space="preserve">You are a manuscript-submission specialist. Calibrate the draft prose to the target</w:t>
       </w:r>
       <w:r>
         <w:br/>
@@ -5168,7 +6154,7 @@
     </w:p>
     <w:bookmarkEnd w:id="20"/>
     <w:bookmarkEnd w:id="21"/>
-    <w:bookmarkStart w:id="24" w:name="Xe9af240a953413b3f13a0594e9a363b07f90388"/>
+    <w:bookmarkStart w:id="24" w:name="X56243fb9a6643fb2ad8a6c966a6841e86bfbd41"/>
     <w:p>
       <w:pPr>
         <w:pStyle w:val="Heading1"/>
@@ -5192,7 +6178,7 @@
         <w:t xml:space="preserve"> </w:t>
       </w:r>
       <w:r>
-        <w:t xml:space="preserve">End-to-end, deterministic data analysis of a raw clinical Excel/CSV dataset with APA 7th reporting — using the repo’s writer agent and templates instead of fabricating output.</w:t>
+        <w:t xml:space="preserve">End-to-end, deterministic data analysis of a raw clinical Excel/CSV dataset with APA 7th reporting — using the repo's writer agent and templates instead of fabricating output.</w:t>
       </w:r>
     </w:p>
     <w:p>
@@ -5311,7 +6297,16 @@
         <w:rPr>
           <w:rStyle w:val="VerbatimChar"/>
         </w:rPr>
-        <w:t xml:space="preserve">citations.</w:t>
+        <w:t xml:space="preserve">citations. If the dataset file cannot be read, STOP and report the exact missing path —</w:t>
+      </w:r>
+      <w:r>
+        <w:br/>
+      </w:r>
+      <w:r>
+        <w:rPr>
+          <w:rStyle w:val="VerbatimChar"/>
+        </w:rPr>
+        <w:t xml:space="preserve">never analyze from memory, and never generate placeholder or "plausible" numbers.</w:t>
       </w:r>
       <w:r>
         <w:br/>
@@ -5721,17 +6716,29 @@
         </w:rPr>
         <w:t xml:space="preserve">Beginner tips</w:t>
       </w:r>
-      <w:r>
-        <w:t xml:space="preserve"> </w:t>
-      </w:r>
-      <w:r>
-        <w:t xml:space="preserve">- The repo does not run SPSS; do your computation in R/Python, then hand the numbers to the repo as a stats JSON to get the APA narrative and DOCX.</w:t>
-      </w:r>
-      <w:r>
-        <w:t xml:space="preserve"> </w:t>
-      </w:r>
-      <w:r>
-        <w:t xml:space="preserve">- Template files are self-contained HTML — open</w:t>
+    </w:p>
+    <w:p>
+      <w:pPr>
+        <w:pStyle w:val="Compact"/>
+        <w:numPr>
+          <w:ilvl w:val="0"/>
+          <w:numId w:val="1006"/>
+        </w:numPr>
+      </w:pPr>
+      <w:r>
+        <w:t xml:space="preserve">The repo does not run SPSS; do your computation in R/Python, then hand the numbers to the repo as a stats JSON to get the APA narrative and DOCX.</w:t>
+      </w:r>
+    </w:p>
+    <w:p>
+      <w:pPr>
+        <w:pStyle w:val="Compact"/>
+        <w:numPr>
+          <w:ilvl w:val="0"/>
+          <w:numId w:val="1006"/>
+        </w:numPr>
+      </w:pPr>
+      <w:r>
+        <w:t xml:space="preserve">Template files are self-contained HTML — open</w:t>
       </w:r>
       <w:r>
         <w:t xml:space="preserve"> </w:t>
@@ -5756,7 +6763,7 @@
         </w:pict>
       </w:r>
     </w:p>
-    <w:bookmarkStart w:id="22" w:name="quick-reference-cli-cheat-sheet"/>
+    <w:bookmarkStart w:id="22" w:name="X08758acdd3badc99e6f396007fdd141cd72f177"/>
     <w:p>
       <w:pPr>
         <w:pStyle w:val="Heading2"/>
@@ -5768,8 +6775,7 @@
     <w:tbl>
       <w:tblPr>
         <w:tblStyle w:val="Table"/>
-        <w:tblW w:type="pct" w:w="5000"/>
-        <w:tblLayout w:type="fixed"/>
+        <w:tblW w:type="auto" w:w="0"/>
         <w:tblLook w:firstRow="1" w:lastRow="0" w:firstColumn="0" w:lastColumn="0" w:noHBand="0" w:noVBand="0" w:val="0020"/>
       </w:tblPr>
       <w:tblGrid>
@@ -5877,7 +6883,7 @@
               <w:pStyle w:val="Compact"/>
             </w:pPr>
             <w:r>
-              <w:t xml:space="preserve">Systematic review</w:t>
+              <w:t xml:space="preserve">Project-grounded thesis Discussion</w:t>
             </w:r>
           </w:p>
         </w:tc>
@@ -5891,7 +6897,7 @@
               <w:rPr>
                 <w:rStyle w:val="VerbatimChar"/>
               </w:rPr>
-              <w:t xml:space="preserve">python main.py --topic "..." --type systematic-review</w:t>
+              <w:t xml:space="preserve">python main.py --topic "..." --type thesis --project-dir "path/to/project"</w:t>
             </w:r>
           </w:p>
         </w:tc>
@@ -5904,7 +6910,7 @@
               <w:pStyle w:val="Compact"/>
             </w:pPr>
             <w:r>
-              <w:t xml:space="preserve">Protocol</w:t>
+              <w:t xml:space="preserve">Systematic review</w:t>
             </w:r>
           </w:p>
         </w:tc>
@@ -5918,7 +6924,7 @@
               <w:rPr>
                 <w:rStyle w:val="VerbatimChar"/>
               </w:rPr>
-              <w:t xml:space="preserve">python main.py --topic "..." --type protocol</w:t>
+              <w:t xml:space="preserve">python main.py --topic "..." --type systematic-review</w:t>
             </w:r>
           </w:p>
         </w:tc>
@@ -5931,7 +6937,7 @@
               <w:pStyle w:val="Compact"/>
             </w:pPr>
             <w:r>
-              <w:t xml:space="preserve">Add your PDFs</w:t>
+              <w:t xml:space="preserve">Protocol</w:t>
             </w:r>
           </w:p>
         </w:tc>
@@ -5942,16 +6948,10 @@
               <w:pStyle w:val="Compact"/>
             </w:pPr>
             <w:r>
-              <w:t xml:space="preserve">append</w:t>
-            </w:r>
-            <w:r>
-              <w:t xml:space="preserve"> </w:t>
-            </w:r>
-            <w:r>
               <w:rPr>
                 <w:rStyle w:val="VerbatimChar"/>
               </w:rPr>
-              <w:t xml:space="preserve">--pdf-input "path/to/study.pdf"</w:t>
+              <w:t xml:space="preserve">python main.py --topic "..." --type protocol</w:t>
             </w:r>
           </w:p>
         </w:tc>
@@ -5964,7 +6964,7 @@
               <w:pStyle w:val="Compact"/>
             </w:pPr>
             <w:r>
-              <w:t xml:space="preserve">Add stats JSON</w:t>
+              <w:t xml:space="preserve">Add your PDFs</w:t>
             </w:r>
           </w:p>
         </w:tc>
@@ -5984,7 +6984,7 @@
               <w:rPr>
                 <w:rStyle w:val="VerbatimChar"/>
               </w:rPr>
-              <w:t xml:space="preserve">--data-file "path/to/stats.json"</w:t>
+              <w:t xml:space="preserve">--pdf-input "path/to/study.pdf"</w:t>
             </w:r>
           </w:p>
         </w:tc>
@@ -5997,7 +6997,7 @@
               <w:pStyle w:val="Compact"/>
             </w:pPr>
             <w:r>
-              <w:t xml:space="preserve">Deeper search</w:t>
+              <w:t xml:space="preserve">Add stats JSON</w:t>
             </w:r>
           </w:p>
         </w:tc>
@@ -6008,10 +7008,16 @@
               <w:pStyle w:val="Compact"/>
             </w:pPr>
             <w:r>
+              <w:t xml:space="preserve">append</w:t>
+            </w:r>
+            <w:r>
+              <w:t xml:space="preserve"> </w:t>
+            </w:r>
+            <w:r>
               <w:rPr>
                 <w:rStyle w:val="VerbatimChar"/>
               </w:rPr>
-              <w:t xml:space="preserve">--search-depth 25</w:t>
+              <w:t xml:space="preserve">--data-file "path/to/stats.json"</w:t>
             </w:r>
           </w:p>
         </w:tc>
@@ -6024,7 +7030,7 @@
               <w:pStyle w:val="Compact"/>
             </w:pPr>
             <w:r>
-              <w:t xml:space="preserve">Harvard/Vancouver</w:t>
+              <w:t xml:space="preserve">Deeper search</w:t>
             </w:r>
           </w:p>
         </w:tc>
@@ -6038,25 +7044,7 @@
               <w:rPr>
                 <w:rStyle w:val="VerbatimChar"/>
               </w:rPr>
-              <w:t xml:space="preserve">--citation-style Harvard</w:t>
-            </w:r>
-            <w:r>
-              <w:t xml:space="preserve"> </w:t>
-            </w:r>
-            <w:r>
-              <w:t xml:space="preserve">(or</w:t>
-            </w:r>
-            <w:r>
-              <w:t xml:space="preserve"> </w:t>
-            </w:r>
-            <w:r>
-              <w:rPr>
-                <w:rStyle w:val="VerbatimChar"/>
-              </w:rPr>
-              <w:t xml:space="preserve">Vancouver</w:t>
-            </w:r>
-            <w:r>
-              <w:t xml:space="preserve">)</w:t>
+              <w:t xml:space="preserve">--search-depth 25</w:t>
             </w:r>
           </w:p>
         </w:tc>
@@ -6069,7 +7057,7 @@
               <w:pStyle w:val="Compact"/>
             </w:pPr>
             <w:r>
-              <w:t xml:space="preserve">MD + DOCX output</w:t>
+              <w:t xml:space="preserve">Harvard/Vancouver</w:t>
             </w:r>
           </w:p>
         </w:tc>
@@ -6083,7 +7071,25 @@
               <w:rPr>
                 <w:rStyle w:val="VerbatimChar"/>
               </w:rPr>
-              <w:t xml:space="preserve">--output-format both</w:t>
+              <w:t xml:space="preserve">--citation-style Harvard</w:t>
+            </w:r>
+            <w:r>
+              <w:t xml:space="preserve"> </w:t>
+            </w:r>
+            <w:r>
+              <w:t xml:space="preserve">(or</w:t>
+            </w:r>
+            <w:r>
+              <w:t xml:space="preserve"> </w:t>
+            </w:r>
+            <w:r>
+              <w:rPr>
+                <w:rStyle w:val="VerbatimChar"/>
+              </w:rPr>
+              <w:t xml:space="preserve">Vancouver</w:t>
+            </w:r>
+            <w:r>
+              <w:t xml:space="preserve">)</w:t>
             </w:r>
           </w:p>
         </w:tc>
@@ -6096,7 +7102,7 @@
               <w:pStyle w:val="Compact"/>
             </w:pPr>
             <w:r>
-              <w:t xml:space="preserve">Journal format DOCX</w:t>
+              <w:t xml:space="preserve">MD + DOCX output</w:t>
             </w:r>
           </w:p>
         </w:tc>
@@ -6110,7 +7116,7 @@
               <w:rPr>
                 <w:rStyle w:val="VerbatimChar"/>
               </w:rPr>
-              <w:t xml:space="preserve">python meddraft_ai/export/formatting_tools/formatting_tools/format_journal_cli.py --input out.docx --output out_MDPI.docx --format MDPI --ris refs.ris --crossref</w:t>
+              <w:t xml:space="preserve">--output-format both</w:t>
             </w:r>
           </w:p>
         </w:tc>
@@ -6123,7 +7129,7 @@
               <w:pStyle w:val="Compact"/>
             </w:pPr>
             <w:r>
-              <w:t xml:space="preserve">Validate references</w:t>
+              <w:t xml:space="preserve">Journal format DOCX</w:t>
             </w:r>
           </w:p>
         </w:tc>
@@ -6137,6 +7143,33 @@
               <w:rPr>
                 <w:rStyle w:val="VerbatimChar"/>
               </w:rPr>
+              <w:t xml:space="preserve">python meddraft_ai/export/formatting_tools/formatting_tools/format_journal_cli.py --input out.docx --output out_MDPI.docx --format MDPI --ris refs.ris --crossref</w:t>
+            </w:r>
+          </w:p>
+        </w:tc>
+      </w:tr>
+      <w:tr>
+        <w:tc>
+          <w:tcPr/>
+          <w:p>
+            <w:pPr>
+              <w:pStyle w:val="Compact"/>
+            </w:pPr>
+            <w:r>
+              <w:t xml:space="preserve">Validate references</w:t>
+            </w:r>
+          </w:p>
+        </w:tc>
+        <w:tc>
+          <w:tcPr/>
+          <w:p>
+            <w:pPr>
+              <w:pStyle w:val="Compact"/>
+            </w:pPr>
+            <w:r>
+              <w:rPr>
+                <w:rStyle w:val="VerbatimChar"/>
+              </w:rPr>
               <w:t xml:space="preserve">python -m meddraft_ai.validation.reference_validator "outputs/draft.md" --format all --output report.json</w:t>
             </w:r>
           </w:p>
@@ -6151,13 +7184,13 @@
       </w:r>
     </w:p>
     <w:bookmarkEnd w:id="22"/>
-    <w:bookmarkStart w:id="23" w:name="known-gaps-so-beginners-dont-get-stuck"/>
+    <w:bookmarkStart w:id="23" w:name="Xb8f9f4c02695a1d3575a2f9c60647c79560f0a7"/>
     <w:p>
       <w:pPr>
         <w:pStyle w:val="Heading2"/>
       </w:pPr>
       <w:r>
-        <w:t xml:space="preserve">⚠️ Known Gaps (so beginners don’t get stuck)</w:t>
+        <w:t xml:space="preserve">⚠️ Known Gaps (so beginners don't get stuck)</w:t>
       </w:r>
     </w:p>
     <w:p>
@@ -6165,77 +7198,27 @@
         <w:pStyle w:val="Compact"/>
         <w:numPr>
           <w:ilvl w:val="0"/>
-          <w:numId w:val="1002"/>
+          <w:numId w:val="1007"/>
         </w:numPr>
       </w:pPr>
       <w:r>
-        <w:rPr>
-          <w:rStyle w:val="VerbatimChar"/>
-        </w:rPr>
-        <w:t xml:space="preserve">FullTextScreener</w:t>
-      </w:r>
-      <w:r>
-        <w:t xml:space="preserve"> </w:t>
-      </w:r>
-      <w:r>
-        <w:t xml:space="preserve">calls</w:t>
-      </w:r>
-      <w:r>
-        <w:t xml:space="preserve"> </w:t>
-      </w:r>
-      <w:r>
-        <w:rPr>
-          <w:rStyle w:val="VerbatimChar"/>
-        </w:rPr>
-        <w:t xml:space="preserve">LLMClient.run_parallel_screening(...)</w:t>
-      </w:r>
-      <w:r>
-        <w:t xml:space="preserve"> </w:t>
-      </w:r>
-      <w:r>
-        <w:t xml:space="preserve">which does not exist yet in</w:t>
-      </w:r>
-      <w:r>
-        <w:t xml:space="preserve"> </w:t>
-      </w:r>
-      <w:r>
-        <w:rPr>
-          <w:rStyle w:val="VerbatimChar"/>
-        </w:rPr>
-        <w:t xml:space="preserve">meddraft_ai/core/llm_client.py</w:t>
-      </w:r>
-      <w:r>
-        <w:t xml:space="preserve"> </w:t>
-      </w:r>
-      <w:r>
-        <w:t xml:space="preserve">(only</w:t>
-      </w:r>
-      <w:r>
-        <w:t xml:space="preserve"> </w:t>
-      </w:r>
-      <w:r>
-        <w:rPr>
-          <w:rStyle w:val="VerbatimChar"/>
-        </w:rPr>
-        <w:t xml:space="preserve">query</w:t>
-      </w:r>
-      <w:r>
-        <w:t xml:space="preserve">). Until fixed, use</w:t>
-      </w:r>
-      <w:r>
-        <w:t xml:space="preserve"> </w:t>
-      </w:r>
-      <w:r>
-        <w:rPr>
-          <w:rStyle w:val="VerbatimChar"/>
-        </w:rPr>
-        <w:t xml:space="preserve">AbstractScreener</w:t>
-      </w:r>
-      <w:r>
-        <w:t xml:space="preserve"> </w:t>
-      </w:r>
-      <w:r>
-        <w:t xml:space="preserve">or call the LLM per record.</w:t>
+        <w:t xml:space="preserve">Reverse-engineering survival curves (IPDfromKM / SPRITE) is</w:t>
+      </w:r>
+      <w:r>
+        <w:t xml:space="preserve"> </w:t>
+      </w:r>
+      <w:r>
+        <w:rPr>
+          <w:b/>
+          <w:bCs/>
+        </w:rPr>
+        <w:t xml:space="preserve">not</w:t>
+      </w:r>
+      <w:r>
+        <w:t xml:space="preserve"> </w:t>
+      </w:r>
+      <w:r>
+        <w:t xml:space="preserve">included in this repo. Use Prompt 4's table-based reconstruction instead.</w:t>
       </w:r>
     </w:p>
     <w:p>
@@ -6243,27 +7226,35 @@
         <w:pStyle w:val="Compact"/>
         <w:numPr>
           <w:ilvl w:val="0"/>
-          <w:numId w:val="1002"/>
+          <w:numId w:val="1007"/>
         </w:numPr>
       </w:pPr>
       <w:r>
-        <w:t xml:space="preserve">Reverse-engineering survival curves (IPDfromKM / SPRITE) is</w:t>
-      </w:r>
-      <w:r>
-        <w:t xml:space="preserve"> </w:t>
-      </w:r>
-      <w:r>
-        <w:rPr>
-          <w:b/>
-          <w:bCs/>
-        </w:rPr>
-        <w:t xml:space="preserve">not</w:t>
-      </w:r>
-      <w:r>
-        <w:t xml:space="preserve"> </w:t>
-      </w:r>
-      <w:r>
-        <w:t xml:space="preserve">included in this repo. Use Prompt 4’s table-based reconstruction instead.</w:t>
+        <w:t xml:space="preserve">Google Scholar needs the Playwright stealth engine built (</w:t>
+      </w:r>
+      <w:r>
+        <w:rPr>
+          <w:rStyle w:val="VerbatimChar"/>
+        </w:rPr>
+        <w:t xml:space="preserve">npm install</w:t>
+      </w:r>
+      <w:r>
+        <w:t xml:space="preserve"> </w:t>
+      </w:r>
+      <w:r>
+        <w:t xml:space="preserve">+</w:t>
+      </w:r>
+      <w:r>
+        <w:t xml:space="preserve"> </w:t>
+      </w:r>
+      <w:r>
+        <w:rPr>
+          <w:rStyle w:val="VerbatimChar"/>
+        </w:rPr>
+        <w:t xml:space="preserve">npx playwright install chromium</w:t>
+      </w:r>
+      <w:r>
+        <w:t xml:space="preserve">), or it silently returns no results.</w:t>
       </w:r>
     </w:p>
     <w:p>
@@ -6271,43 +7262,7 @@
         <w:pStyle w:val="Compact"/>
         <w:numPr>
           <w:ilvl w:val="0"/>
-          <w:numId w:val="1002"/>
-        </w:numPr>
-      </w:pPr>
-      <w:r>
-        <w:t xml:space="preserve">Google Scholar needs the Playwright stealth engine built (</w:t>
-      </w:r>
-      <w:r>
-        <w:rPr>
-          <w:rStyle w:val="VerbatimChar"/>
-        </w:rPr>
-        <w:t xml:space="preserve">npm install</w:t>
-      </w:r>
-      <w:r>
-        <w:t xml:space="preserve"> </w:t>
-      </w:r>
-      <w:r>
-        <w:t xml:space="preserve">+</w:t>
-      </w:r>
-      <w:r>
-        <w:t xml:space="preserve"> </w:t>
-      </w:r>
-      <w:r>
-        <w:rPr>
-          <w:rStyle w:val="VerbatimChar"/>
-        </w:rPr>
-        <w:t xml:space="preserve">npx playwright install chromium</w:t>
-      </w:r>
-      <w:r>
-        <w:t xml:space="preserve">), or it silently returns no results.</w:t>
-      </w:r>
-    </w:p>
-    <w:p>
-      <w:pPr>
-        <w:pStyle w:val="Compact"/>
-        <w:numPr>
-          <w:ilvl w:val="0"/>
-          <w:numId w:val="1002"/>
+          <w:numId w:val="1007"/>
         </w:numPr>
       </w:pPr>
       <w:r>
@@ -6675,6 +7630,21 @@
     </w:lvlOverride>
   </w:num>
   <w:num w:numId="1002">
+    <w:abstractNumId w:val="991"/>
+  </w:num>
+  <w:num w:numId="1003">
+    <w:abstractNumId w:val="991"/>
+  </w:num>
+  <w:num w:numId="1004">
+    <w:abstractNumId w:val="991"/>
+  </w:num>
+  <w:num w:numId="1005">
+    <w:abstractNumId w:val="991"/>
+  </w:num>
+  <w:num w:numId="1006">
+    <w:abstractNumId w:val="991"/>
+  </w:num>
+  <w:num w:numId="1007">
     <w:abstractNumId w:val="991"/>
   </w:num>
 </w:numbering>

</xml_diff>